<commit_message>
feat: projet complet - etapes 1 2 3 4 + app streamlit + LLM
</commit_message>
<xml_diff>
--- a/outputs/documentation_etape1.docx
+++ b/outputs/documentation_etape1.docx
@@ -33,7 +33,7 @@
           <w:sz w:val="28"/>
           <w:szCs w:val="28"/>
         </w:rPr>
-        <w:t xml:space="preserve">Étape 1 — Data Acquisition &amp; Prétraitement</w:t>
+        <w:t xml:space="preserve">Étape 1 — Data Acquisition, Préparation &amp; Contrôle Qualité</w:t>
       </w:r>
     </w:p>
     <w:p>
@@ -103,7 +103,7 @@
           <w:sz w:val="22"/>
           <w:szCs w:val="22"/>
         </w:rPr>
-        <w:t xml:space="preserve">L'étape 1 constitue le fondement du pipeline complet. Elle transforme les données brutes du dataset Insurance Claims (58 592 polices, 41 variables) en un format numérique propre, cohérent et exploitable par les modèles de deep learning génératif des étapes suivantes.</w:t>
+        <w:t xml:space="preserve">L'étape 1 constitue le fondement du pipeline complet. Elle couvre l'acquisition, la préparation, la transformation, le contrôle qualité et le nettoyage des données brutes du dataset Insurance Claims (58 592 polices, 41 variables), conformément aux consignes du projet.</w:t>
       </w:r>
     </w:p>
     <w:p>
@@ -116,7 +116,7 @@
           <w:sz w:val="22"/>
           <w:szCs w:val="22"/>
         </w:rPr>
-        <w:t xml:space="preserve">Le dataset présente un déséquilibre de classes sévère : seulement 6,4% des polices ont généré un sinistre. C'est ce constat qui motive l'ensemble du projet de génération synthétique.</w:t>
+        <w:t xml:space="preserve">Le dataset présente un déséquilibre de classes sévère : seulement 6,4% des polices ont généré un sinistre (3 748 sur 58 592), soit un ratio de 1 pour 14. C'est ce constat qui motive l'ensemble du projet de génération synthétique.</w:t>
       </w:r>
     </w:p>
     <w:p>
@@ -151,12 +151,12 @@
           <w:sz w:val="22"/>
           <w:szCs w:val="22"/>
         </w:rPr>
-        <w:t xml:space="preserve">Le script est organisé en 8 blocs séquentiels numérotés, chacun correspondant à une transformation précise :</w:t>
-      </w:r>
-    </w:p>
-    <w:p>
-      <w:pPr>
-        <w:spacing w:after="120" w:before="120"/>
+        <w:t xml:space="preserve">Le script est organisé en 9 blocs séquentiels numérotés :</w:t>
+      </w:r>
+    </w:p>
+    <w:p>
+      <w:pPr>
+        <w:spacing w:after="80" w:before="80"/>
       </w:pPr>
     </w:p>
     <w:tbl>
@@ -172,9 +172,9 @@
         </w:tblBorders>
       </w:tblPr>
       <w:tblGrid>
-        <w:gridCol w:w="800"/>
-        <w:gridCol w:w="3000"/>
-        <w:gridCol w:w="5226"/>
+        <w:gridCol w:w="600"/>
+        <w:gridCol w:w="2400"/>
+        <w:gridCol w:w="6026"/>
       </w:tblGrid>
       <w:tr>
         <w:trPr>
@@ -182,7 +182,7 @@
         </w:trPr>
         <w:tc>
           <w:tcPr>
-            <w:tcW w:type="dxa" w:w="800"/>
+            <w:tcW w:type="dxa" w:w="600"/>
             <w:tcBorders>
               <w:top w:val="single" w:color="1F4E79" w:sz="1"/>
               <w:left w:val="single" w:color="1F4E79" w:sz="1"/>
@@ -213,7 +213,7 @@
         </w:tc>
         <w:tc>
           <w:tcPr>
-            <w:tcW w:type="dxa" w:w="3000"/>
+            <w:tcW w:type="dxa" w:w="2400"/>
             <w:tcBorders>
               <w:top w:val="single" w:color="1F4E79" w:sz="1"/>
               <w:left w:val="single" w:color="1F4E79" w:sz="1"/>
@@ -244,7 +244,7 @@
         </w:tc>
         <w:tc>
           <w:tcPr>
-            <w:tcW w:type="dxa" w:w="5226"/>
+            <w:tcW w:type="dxa" w:w="6026"/>
             <w:tcBorders>
               <w:top w:val="single" w:color="1F4E79" w:sz="1"/>
               <w:left w:val="single" w:color="1F4E79" w:sz="1"/>
@@ -277,7 +277,7 @@
       <w:tr>
         <w:tc>
           <w:tcPr>
-            <w:tcW w:type="dxa" w:w="800"/>
+            <w:tcW w:type="dxa" w:w="600"/>
             <w:tcBorders>
               <w:top w:val="single" w:color="CCCCCC" w:sz="1"/>
               <w:left w:val="single" w:color="CCCCCC" w:sz="1"/>
@@ -305,57 +305,57 @@
         </w:tc>
         <w:tc>
           <w:tcPr>
-            <w:tcW w:type="dxa" w:w="3000"/>
-            <w:tcBorders>
-              <w:top w:val="single" w:color="CCCCCC" w:sz="1"/>
-              <w:left w:val="single" w:color="CCCCCC" w:sz="1"/>
-              <w:bottom w:val="single" w:color="CCCCCC" w:sz="1"/>
-              <w:right w:val="single" w:color="CCCCCC" w:sz="1"/>
-            </w:tcBorders>
-            <w:shd w:fill="F5F8FC" w:val="clear"/>
-            <w:tcMar>
-              <w:top w:type="dxa" w:w="60"/>
-              <w:left w:type="dxa" w:w="120"/>
-              <w:bottom w:type="dxa" w:w="60"/>
-              <w:right w:type="dxa" w:w="120"/>
-            </w:tcMar>
-          </w:tcPr>
-          <w:p>
-            <w:r>
-              <w:rPr>
-                <w:rFonts w:ascii="Arial" w:cs="Arial" w:eastAsia="Arial" w:hAnsi="Arial"/>
-                <w:sz w:val="20"/>
-                <w:szCs w:val="20"/>
-              </w:rPr>
-              <w:t xml:space="preserve">Chargement</w:t>
-            </w:r>
-          </w:p>
-        </w:tc>
-        <w:tc>
-          <w:tcPr>
-            <w:tcW w:type="dxa" w:w="5226"/>
-            <w:tcBorders>
-              <w:top w:val="single" w:color="CCCCCC" w:sz="1"/>
-              <w:left w:val="single" w:color="CCCCCC" w:sz="1"/>
-              <w:bottom w:val="single" w:color="CCCCCC" w:sz="1"/>
-              <w:right w:val="single" w:color="CCCCCC" w:sz="1"/>
-            </w:tcBorders>
-            <w:shd w:fill="F5F8FC" w:val="clear"/>
-            <w:tcMar>
-              <w:top w:type="dxa" w:w="60"/>
-              <w:left w:type="dxa" w:w="120"/>
-              <w:bottom w:type="dxa" w:w="60"/>
-              <w:right w:type="dxa" w:w="120"/>
-            </w:tcMar>
-          </w:tcPr>
-          <w:p>
-            <w:r>
-              <w:rPr>
-                <w:rFonts w:ascii="Arial" w:cs="Arial" w:eastAsia="Arial" w:hAnsi="Arial"/>
-                <w:sz w:val="20"/>
-                <w:szCs w:val="20"/>
-              </w:rPr>
-              <w:t xml:space="preserve">Lecture du CSV brut avec pandas</w:t>
+            <w:tcW w:type="dxa" w:w="2400"/>
+            <w:tcBorders>
+              <w:top w:val="single" w:color="CCCCCC" w:sz="1"/>
+              <w:left w:val="single" w:color="CCCCCC" w:sz="1"/>
+              <w:bottom w:val="single" w:color="CCCCCC" w:sz="1"/>
+              <w:right w:val="single" w:color="CCCCCC" w:sz="1"/>
+            </w:tcBorders>
+            <w:shd w:fill="F5F8FC" w:val="clear"/>
+            <w:tcMar>
+              <w:top w:type="dxa" w:w="60"/>
+              <w:left w:type="dxa" w:w="120"/>
+              <w:bottom w:type="dxa" w:w="60"/>
+              <w:right w:type="dxa" w:w="120"/>
+            </w:tcMar>
+          </w:tcPr>
+          <w:p>
+            <w:r>
+              <w:rPr>
+                <w:rFonts w:ascii="Arial" w:cs="Arial" w:eastAsia="Arial" w:hAnsi="Arial"/>
+                <w:sz w:val="20"/>
+                <w:szCs w:val="20"/>
+              </w:rPr>
+              <w:t xml:space="preserve">Acquisition</w:t>
+            </w:r>
+          </w:p>
+        </w:tc>
+        <w:tc>
+          <w:tcPr>
+            <w:tcW w:type="dxa" w:w="6026"/>
+            <w:tcBorders>
+              <w:top w:val="single" w:color="CCCCCC" w:sz="1"/>
+              <w:left w:val="single" w:color="CCCCCC" w:sz="1"/>
+              <w:bottom w:val="single" w:color="CCCCCC" w:sz="1"/>
+              <w:right w:val="single" w:color="CCCCCC" w:sz="1"/>
+            </w:tcBorders>
+            <w:shd w:fill="F5F8FC" w:val="clear"/>
+            <w:tcMar>
+              <w:top w:type="dxa" w:w="60"/>
+              <w:left w:type="dxa" w:w="120"/>
+              <w:bottom w:type="dxa" w:w="60"/>
+              <w:right w:type="dxa" w:w="120"/>
+            </w:tcMar>
+          </w:tcPr>
+          <w:p>
+            <w:r>
+              <w:rPr>
+                <w:rFonts w:ascii="Arial" w:cs="Arial" w:eastAsia="Arial" w:hAnsi="Arial"/>
+                <w:sz w:val="20"/>
+                <w:szCs w:val="20"/>
+              </w:rPr>
+              <w:t xml:space="preserve">Chargement du CSV brut avec pandas</w:t>
             </w:r>
           </w:p>
         </w:tc>
@@ -363,7 +363,7 @@
       <w:tr>
         <w:tc>
           <w:tcPr>
-            <w:tcW w:type="dxa" w:w="800"/>
+            <w:tcW w:type="dxa" w:w="600"/>
             <w:tcBorders>
               <w:top w:val="single" w:color="CCCCCC" w:sz="1"/>
               <w:left w:val="single" w:color="CCCCCC" w:sz="1"/>
@@ -391,7 +391,7 @@
         </w:tc>
         <w:tc>
           <w:tcPr>
-            <w:tcW w:type="dxa" w:w="3000"/>
+            <w:tcW w:type="dxa" w:w="2400"/>
             <w:tcBorders>
               <w:top w:val="single" w:color="CCCCCC" w:sz="1"/>
               <w:left w:val="single" w:color="CCCCCC" w:sz="1"/>
@@ -413,13 +413,13 @@
                 <w:sz w:val="20"/>
                 <w:szCs w:val="20"/>
               </w:rPr>
-              <w:t xml:space="preserve">Suppression identifiant</w:t>
-            </w:r>
-          </w:p>
-        </w:tc>
-        <w:tc>
-          <w:tcPr>
-            <w:tcW w:type="dxa" w:w="5226"/>
+              <w:t xml:space="preserve">Contrôle qualité</w:t>
+            </w:r>
+          </w:p>
+        </w:tc>
+        <w:tc>
+          <w:tcPr>
+            <w:tcW w:type="dxa" w:w="6026"/>
             <w:tcBorders>
               <w:top w:val="single" w:color="CCCCCC" w:sz="1"/>
               <w:left w:val="single" w:color="CCCCCC" w:sz="1"/>
@@ -441,7 +441,7 @@
                 <w:sz w:val="20"/>
                 <w:szCs w:val="20"/>
               </w:rPr>
-              <w:t xml:space="preserve">Retrait de policy_id (non informatif)</w:t>
+              <w:t xml:space="preserve">Doublons, valeurs manquantes, plages, cohérence métier, outliers</w:t>
             </w:r>
           </w:p>
         </w:tc>
@@ -449,7 +449,7 @@
       <w:tr>
         <w:tc>
           <w:tcPr>
-            <w:tcW w:type="dxa" w:w="800"/>
+            <w:tcW w:type="dxa" w:w="600"/>
             <w:tcBorders>
               <w:top w:val="single" w:color="CCCCCC" w:sz="1"/>
               <w:left w:val="single" w:color="CCCCCC" w:sz="1"/>
@@ -477,57 +477,57 @@
         </w:tc>
         <w:tc>
           <w:tcPr>
-            <w:tcW w:type="dxa" w:w="3000"/>
-            <w:tcBorders>
-              <w:top w:val="single" w:color="CCCCCC" w:sz="1"/>
-              <w:left w:val="single" w:color="CCCCCC" w:sz="1"/>
-              <w:bottom w:val="single" w:color="CCCCCC" w:sz="1"/>
-              <w:right w:val="single" w:color="CCCCCC" w:sz="1"/>
-            </w:tcBorders>
-            <w:shd w:fill="F5F8FC" w:val="clear"/>
-            <w:tcMar>
-              <w:top w:type="dxa" w:w="60"/>
-              <w:left w:type="dxa" w:w="120"/>
-              <w:bottom w:type="dxa" w:w="60"/>
-              <w:right w:type="dxa" w:w="120"/>
-            </w:tcMar>
-          </w:tcPr>
-          <w:p>
-            <w:r>
-              <w:rPr>
-                <w:rFonts w:ascii="Arial" w:cs="Arial" w:eastAsia="Arial" w:hAnsi="Arial"/>
-                <w:sz w:val="20"/>
-                <w:szCs w:val="20"/>
-              </w:rPr>
-              <w:t xml:space="preserve">Parsing max_torque / max_power</w:t>
-            </w:r>
-          </w:p>
-        </w:tc>
-        <w:tc>
-          <w:tcPr>
-            <w:tcW w:type="dxa" w:w="5226"/>
-            <w:tcBorders>
-              <w:top w:val="single" w:color="CCCCCC" w:sz="1"/>
-              <w:left w:val="single" w:color="CCCCCC" w:sz="1"/>
-              <w:bottom w:val="single" w:color="CCCCCC" w:sz="1"/>
-              <w:right w:val="single" w:color="CCCCCC" w:sz="1"/>
-            </w:tcBorders>
-            <w:shd w:fill="F5F8FC" w:val="clear"/>
-            <w:tcMar>
-              <w:top w:type="dxa" w:w="60"/>
-              <w:left w:type="dxa" w:w="120"/>
-              <w:bottom w:type="dxa" w:w="60"/>
-              <w:right w:type="dxa" w:w="120"/>
-            </w:tcMar>
-          </w:tcPr>
-          <w:p>
-            <w:r>
-              <w:rPr>
-                <w:rFonts w:ascii="Arial" w:cs="Arial" w:eastAsia="Arial" w:hAnsi="Arial"/>
-                <w:sz w:val="20"/>
-                <w:szCs w:val="20"/>
-              </w:rPr>
-              <w:t xml:space="preserve">Extraction de 4 valeurs numériques via regex</w:t>
+            <w:tcW w:type="dxa" w:w="2400"/>
+            <w:tcBorders>
+              <w:top w:val="single" w:color="CCCCCC" w:sz="1"/>
+              <w:left w:val="single" w:color="CCCCCC" w:sz="1"/>
+              <w:bottom w:val="single" w:color="CCCCCC" w:sz="1"/>
+              <w:right w:val="single" w:color="CCCCCC" w:sz="1"/>
+            </w:tcBorders>
+            <w:shd w:fill="F5F8FC" w:val="clear"/>
+            <w:tcMar>
+              <w:top w:type="dxa" w:w="60"/>
+              <w:left w:type="dxa" w:w="120"/>
+              <w:bottom w:type="dxa" w:w="60"/>
+              <w:right w:type="dxa" w:w="120"/>
+            </w:tcMar>
+          </w:tcPr>
+          <w:p>
+            <w:r>
+              <w:rPr>
+                <w:rFonts w:ascii="Arial" w:cs="Arial" w:eastAsia="Arial" w:hAnsi="Arial"/>
+                <w:sz w:val="20"/>
+                <w:szCs w:val="20"/>
+              </w:rPr>
+              <w:t xml:space="preserve">Préparation</w:t>
+            </w:r>
+          </w:p>
+        </w:tc>
+        <w:tc>
+          <w:tcPr>
+            <w:tcW w:type="dxa" w:w="6026"/>
+            <w:tcBorders>
+              <w:top w:val="single" w:color="CCCCCC" w:sz="1"/>
+              <w:left w:val="single" w:color="CCCCCC" w:sz="1"/>
+              <w:bottom w:val="single" w:color="CCCCCC" w:sz="1"/>
+              <w:right w:val="single" w:color="CCCCCC" w:sz="1"/>
+            </w:tcBorders>
+            <w:shd w:fill="F5F8FC" w:val="clear"/>
+            <w:tcMar>
+              <w:top w:type="dxa" w:w="60"/>
+              <w:left w:type="dxa" w:w="120"/>
+              <w:bottom w:type="dxa" w:w="60"/>
+              <w:right w:type="dxa" w:w="120"/>
+            </w:tcMar>
+          </w:tcPr>
+          <w:p>
+            <w:r>
+              <w:rPr>
+                <w:rFonts w:ascii="Arial" w:cs="Arial" w:eastAsia="Arial" w:hAnsi="Arial"/>
+                <w:sz w:val="20"/>
+                <w:szCs w:val="20"/>
+              </w:rPr>
+              <w:t xml:space="preserve">Suppression de policy_id (identifiant non informatif)</w:t>
             </w:r>
           </w:p>
         </w:tc>
@@ -535,7 +535,7 @@
       <w:tr>
         <w:tc>
           <w:tcPr>
-            <w:tcW w:type="dxa" w:w="800"/>
+            <w:tcW w:type="dxa" w:w="600"/>
             <w:tcBorders>
               <w:top w:val="single" w:color="CCCCCC" w:sz="1"/>
               <w:left w:val="single" w:color="CCCCCC" w:sz="1"/>
@@ -563,7 +563,7 @@
         </w:tc>
         <w:tc>
           <w:tcPr>
-            <w:tcW w:type="dxa" w:w="3000"/>
+            <w:tcW w:type="dxa" w:w="2400"/>
             <w:tcBorders>
               <w:top w:val="single" w:color="CCCCCC" w:sz="1"/>
               <w:left w:val="single" w:color="CCCCCC" w:sz="1"/>
@@ -585,13 +585,13 @@
                 <w:sz w:val="20"/>
                 <w:szCs w:val="20"/>
               </w:rPr>
-              <w:t xml:space="preserve">Encodage binaire</w:t>
-            </w:r>
-          </w:p>
-        </w:tc>
-        <w:tc>
-          <w:tcPr>
-            <w:tcW w:type="dxa" w:w="5226"/>
+              <w:t xml:space="preserve">Transformation</w:t>
+            </w:r>
+          </w:p>
+        </w:tc>
+        <w:tc>
+          <w:tcPr>
+            <w:tcW w:type="dxa" w:w="6026"/>
             <w:tcBorders>
               <w:top w:val="single" w:color="CCCCCC" w:sz="1"/>
               <w:left w:val="single" w:color="CCCCCC" w:sz="1"/>
@@ -613,7 +613,7 @@
                 <w:sz w:val="20"/>
                 <w:szCs w:val="20"/>
               </w:rPr>
-              <w:t xml:space="preserve">Conversion Yes/No → 0/1 sur 17 colonnes</w:t>
+              <w:t xml:space="preserve">Parsing regex de max_torque et max_power → 4 colonnes numériques</w:t>
             </w:r>
           </w:p>
         </w:tc>
@@ -621,7 +621,7 @@
       <w:tr>
         <w:tc>
           <w:tcPr>
-            <w:tcW w:type="dxa" w:w="800"/>
+            <w:tcW w:type="dxa" w:w="600"/>
             <w:tcBorders>
               <w:top w:val="single" w:color="CCCCCC" w:sz="1"/>
               <w:left w:val="single" w:color="CCCCCC" w:sz="1"/>
@@ -649,57 +649,57 @@
         </w:tc>
         <w:tc>
           <w:tcPr>
-            <w:tcW w:type="dxa" w:w="3000"/>
-            <w:tcBorders>
-              <w:top w:val="single" w:color="CCCCCC" w:sz="1"/>
-              <w:left w:val="single" w:color="CCCCCC" w:sz="1"/>
-              <w:bottom w:val="single" w:color="CCCCCC" w:sz="1"/>
-              <w:right w:val="single" w:color="CCCCCC" w:sz="1"/>
-            </w:tcBorders>
-            <w:shd w:fill="F5F8FC" w:val="clear"/>
-            <w:tcMar>
-              <w:top w:type="dxa" w:w="60"/>
-              <w:left w:type="dxa" w:w="120"/>
-              <w:bottom w:type="dxa" w:w="60"/>
-              <w:right w:type="dxa" w:w="120"/>
-            </w:tcMar>
-          </w:tcPr>
-          <w:p>
-            <w:r>
-              <w:rPr>
-                <w:rFonts w:ascii="Arial" w:cs="Arial" w:eastAsia="Arial" w:hAnsi="Arial"/>
-                <w:sz w:val="20"/>
-                <w:szCs w:val="20"/>
-              </w:rPr>
-              <w:t xml:space="preserve">One-hot encoding</w:t>
-            </w:r>
-          </w:p>
-        </w:tc>
-        <w:tc>
-          <w:tcPr>
-            <w:tcW w:type="dxa" w:w="5226"/>
-            <w:tcBorders>
-              <w:top w:val="single" w:color="CCCCCC" w:sz="1"/>
-              <w:left w:val="single" w:color="CCCCCC" w:sz="1"/>
-              <w:bottom w:val="single" w:color="CCCCCC" w:sz="1"/>
-              <w:right w:val="single" w:color="CCCCCC" w:sz="1"/>
-            </w:tcBorders>
-            <w:shd w:fill="F5F8FC" w:val="clear"/>
-            <w:tcMar>
-              <w:top w:type="dxa" w:w="60"/>
-              <w:left w:type="dxa" w:w="120"/>
-              <w:bottom w:type="dxa" w:w="60"/>
-              <w:right w:type="dxa" w:w="120"/>
-            </w:tcMar>
-          </w:tcPr>
-          <w:p>
-            <w:r>
-              <w:rPr>
-                <w:rFonts w:ascii="Arial" w:cs="Arial" w:eastAsia="Arial" w:hAnsi="Arial"/>
-                <w:sz w:val="20"/>
-                <w:szCs w:val="20"/>
-              </w:rPr>
-              <w:t xml:space="preserve">Encodage de 8 variables catégorielles nominales</w:t>
+            <w:tcW w:type="dxa" w:w="2400"/>
+            <w:tcBorders>
+              <w:top w:val="single" w:color="CCCCCC" w:sz="1"/>
+              <w:left w:val="single" w:color="CCCCCC" w:sz="1"/>
+              <w:bottom w:val="single" w:color="CCCCCC" w:sz="1"/>
+              <w:right w:val="single" w:color="CCCCCC" w:sz="1"/>
+            </w:tcBorders>
+            <w:shd w:fill="F5F8FC" w:val="clear"/>
+            <w:tcMar>
+              <w:top w:type="dxa" w:w="60"/>
+              <w:left w:type="dxa" w:w="120"/>
+              <w:bottom w:type="dxa" w:w="60"/>
+              <w:right w:type="dxa" w:w="120"/>
+            </w:tcMar>
+          </w:tcPr>
+          <w:p>
+            <w:r>
+              <w:rPr>
+                <w:rFonts w:ascii="Arial" w:cs="Arial" w:eastAsia="Arial" w:hAnsi="Arial"/>
+                <w:sz w:val="20"/>
+                <w:szCs w:val="20"/>
+              </w:rPr>
+              <w:t xml:space="preserve">Transformation</w:t>
+            </w:r>
+          </w:p>
+        </w:tc>
+        <w:tc>
+          <w:tcPr>
+            <w:tcW w:type="dxa" w:w="6026"/>
+            <w:tcBorders>
+              <w:top w:val="single" w:color="CCCCCC" w:sz="1"/>
+              <w:left w:val="single" w:color="CCCCCC" w:sz="1"/>
+              <w:bottom w:val="single" w:color="CCCCCC" w:sz="1"/>
+              <w:right w:val="single" w:color="CCCCCC" w:sz="1"/>
+            </w:tcBorders>
+            <w:shd w:fill="F5F8FC" w:val="clear"/>
+            <w:tcMar>
+              <w:top w:type="dxa" w:w="60"/>
+              <w:left w:type="dxa" w:w="120"/>
+              <w:bottom w:type="dxa" w:w="60"/>
+              <w:right w:type="dxa" w:w="120"/>
+            </w:tcMar>
+          </w:tcPr>
+          <w:p>
+            <w:r>
+              <w:rPr>
+                <w:rFonts w:ascii="Arial" w:cs="Arial" w:eastAsia="Arial" w:hAnsi="Arial"/>
+                <w:sz w:val="20"/>
+                <w:szCs w:val="20"/>
+              </w:rPr>
+              <w:t xml:space="preserve">Encodage Yes/No → 0/1 sur 17 colonnes binaires</w:t>
             </w:r>
           </w:p>
         </w:tc>
@@ -707,7 +707,7 @@
       <w:tr>
         <w:tc>
           <w:tcPr>
-            <w:tcW w:type="dxa" w:w="800"/>
+            <w:tcW w:type="dxa" w:w="600"/>
             <w:tcBorders>
               <w:top w:val="single" w:color="CCCCCC" w:sz="1"/>
               <w:left w:val="single" w:color="CCCCCC" w:sz="1"/>
@@ -735,7 +735,7 @@
         </w:tc>
         <w:tc>
           <w:tcPr>
-            <w:tcW w:type="dxa" w:w="3000"/>
+            <w:tcW w:type="dxa" w:w="2400"/>
             <w:tcBorders>
               <w:top w:val="single" w:color="CCCCCC" w:sz="1"/>
               <w:left w:val="single" w:color="CCCCCC" w:sz="1"/>
@@ -757,13 +757,13 @@
                 <w:sz w:val="20"/>
                 <w:szCs w:val="20"/>
               </w:rPr>
-              <w:t xml:space="preserve">Vérification déséquilibre</w:t>
-            </w:r>
-          </w:p>
-        </w:tc>
-        <w:tc>
-          <w:tcPr>
-            <w:tcW w:type="dxa" w:w="5226"/>
+              <w:t xml:space="preserve">Transformation</w:t>
+            </w:r>
+          </w:p>
+        </w:tc>
+        <w:tc>
+          <w:tcPr>
+            <w:tcW w:type="dxa" w:w="6026"/>
             <w:tcBorders>
               <w:top w:val="single" w:color="CCCCCC" w:sz="1"/>
               <w:left w:val="single" w:color="CCCCCC" w:sz="1"/>
@@ -785,7 +785,7 @@
                 <w:sz w:val="20"/>
                 <w:szCs w:val="20"/>
               </w:rPr>
-              <w:t xml:space="preserve">Calcul et affichage du ratio de classes</w:t>
+              <w:t xml:space="preserve">One-hot encoding sur 8 variables catégorielles nominales</w:t>
             </w:r>
           </w:p>
         </w:tc>
@@ -793,7 +793,7 @@
       <w:tr>
         <w:tc>
           <w:tcPr>
-            <w:tcW w:type="dxa" w:w="800"/>
+            <w:tcW w:type="dxa" w:w="600"/>
             <w:tcBorders>
               <w:top w:val="single" w:color="CCCCCC" w:sz="1"/>
               <w:left w:val="single" w:color="CCCCCC" w:sz="1"/>
@@ -821,57 +821,57 @@
         </w:tc>
         <w:tc>
           <w:tcPr>
-            <w:tcW w:type="dxa" w:w="3000"/>
-            <w:tcBorders>
-              <w:top w:val="single" w:color="CCCCCC" w:sz="1"/>
-              <w:left w:val="single" w:color="CCCCCC" w:sz="1"/>
-              <w:bottom w:val="single" w:color="CCCCCC" w:sz="1"/>
-              <w:right w:val="single" w:color="CCCCCC" w:sz="1"/>
-            </w:tcBorders>
-            <w:shd w:fill="F5F8FC" w:val="clear"/>
-            <w:tcMar>
-              <w:top w:type="dxa" w:w="60"/>
-              <w:left w:type="dxa" w:w="120"/>
-              <w:bottom w:type="dxa" w:w="60"/>
-              <w:right w:type="dxa" w:w="120"/>
-            </w:tcMar>
-          </w:tcPr>
-          <w:p>
-            <w:r>
-              <w:rPr>
-                <w:rFonts w:ascii="Arial" w:cs="Arial" w:eastAsia="Arial" w:hAnsi="Arial"/>
-                <w:sz w:val="20"/>
-                <w:szCs w:val="20"/>
-              </w:rPr>
-              <w:t xml:space="preserve">Normalisation</w:t>
-            </w:r>
-          </w:p>
-        </w:tc>
-        <w:tc>
-          <w:tcPr>
-            <w:tcW w:type="dxa" w:w="5226"/>
-            <w:tcBorders>
-              <w:top w:val="single" w:color="CCCCCC" w:sz="1"/>
-              <w:left w:val="single" w:color="CCCCCC" w:sz="1"/>
-              <w:bottom w:val="single" w:color="CCCCCC" w:sz="1"/>
-              <w:right w:val="single" w:color="CCCCCC" w:sz="1"/>
-            </w:tcBorders>
-            <w:shd w:fill="F5F8FC" w:val="clear"/>
-            <w:tcMar>
-              <w:top w:type="dxa" w:w="60"/>
-              <w:left w:type="dxa" w:w="120"/>
-              <w:bottom w:type="dxa" w:w="60"/>
-              <w:right w:type="dxa" w:w="120"/>
-            </w:tcMar>
-          </w:tcPr>
-          <w:p>
-            <w:r>
-              <w:rPr>
-                <w:rFonts w:ascii="Arial" w:cs="Arial" w:eastAsia="Arial" w:hAnsi="Arial"/>
-                <w:sz w:val="20"/>
-                <w:szCs w:val="20"/>
-              </w:rPr>
-              <w:t xml:space="preserve">StandardScaler sur 15 colonnes numériques continues</w:t>
+            <w:tcW w:type="dxa" w:w="2400"/>
+            <w:tcBorders>
+              <w:top w:val="single" w:color="CCCCCC" w:sz="1"/>
+              <w:left w:val="single" w:color="CCCCCC" w:sz="1"/>
+              <w:bottom w:val="single" w:color="CCCCCC" w:sz="1"/>
+              <w:right w:val="single" w:color="CCCCCC" w:sz="1"/>
+            </w:tcBorders>
+            <w:shd w:fill="F5F8FC" w:val="clear"/>
+            <w:tcMar>
+              <w:top w:type="dxa" w:w="60"/>
+              <w:left w:type="dxa" w:w="120"/>
+              <w:bottom w:type="dxa" w:w="60"/>
+              <w:right w:type="dxa" w:w="120"/>
+            </w:tcMar>
+          </w:tcPr>
+          <w:p>
+            <w:r>
+              <w:rPr>
+                <w:rFonts w:ascii="Arial" w:cs="Arial" w:eastAsia="Arial" w:hAnsi="Arial"/>
+                <w:sz w:val="20"/>
+                <w:szCs w:val="20"/>
+              </w:rPr>
+              <w:t xml:space="preserve">Analyse</w:t>
+            </w:r>
+          </w:p>
+        </w:tc>
+        <w:tc>
+          <w:tcPr>
+            <w:tcW w:type="dxa" w:w="6026"/>
+            <w:tcBorders>
+              <w:top w:val="single" w:color="CCCCCC" w:sz="1"/>
+              <w:left w:val="single" w:color="CCCCCC" w:sz="1"/>
+              <w:bottom w:val="single" w:color="CCCCCC" w:sz="1"/>
+              <w:right w:val="single" w:color="CCCCCC" w:sz="1"/>
+            </w:tcBorders>
+            <w:shd w:fill="F5F8FC" w:val="clear"/>
+            <w:tcMar>
+              <w:top w:type="dxa" w:w="60"/>
+              <w:left w:type="dxa" w:w="120"/>
+              <w:bottom w:type="dxa" w:w="60"/>
+              <w:right w:type="dxa" w:w="120"/>
+            </w:tcMar>
+          </w:tcPr>
+          <w:p>
+            <w:r>
+              <w:rPr>
+                <w:rFonts w:ascii="Arial" w:cs="Arial" w:eastAsia="Arial" w:hAnsi="Arial"/>
+                <w:sz w:val="20"/>
+                <w:szCs w:val="20"/>
+              </w:rPr>
+              <w:t xml:space="preserve">Vérification et affichage du déséquilibre des classes</w:t>
             </w:r>
           </w:p>
         </w:tc>
@@ -879,7 +879,7 @@
       <w:tr>
         <w:tc>
           <w:tcPr>
-            <w:tcW w:type="dxa" w:w="800"/>
+            <w:tcW w:type="dxa" w:w="600"/>
             <w:tcBorders>
               <w:top w:val="single" w:color="CCCCCC" w:sz="1"/>
               <w:left w:val="single" w:color="CCCCCC" w:sz="1"/>
@@ -907,7 +907,7 @@
         </w:tc>
         <w:tc>
           <w:tcPr>
-            <w:tcW w:type="dxa" w:w="3000"/>
+            <w:tcW w:type="dxa" w:w="2400"/>
             <w:tcBorders>
               <w:top w:val="single" w:color="CCCCCC" w:sz="1"/>
               <w:left w:val="single" w:color="CCCCCC" w:sz="1"/>
@@ -929,20 +929,106 @@
                 <w:sz w:val="20"/>
                 <w:szCs w:val="20"/>
               </w:rPr>
+              <w:t xml:space="preserve">Transformation</w:t>
+            </w:r>
+          </w:p>
+        </w:tc>
+        <w:tc>
+          <w:tcPr>
+            <w:tcW w:type="dxa" w:w="6026"/>
+            <w:tcBorders>
+              <w:top w:val="single" w:color="CCCCCC" w:sz="1"/>
+              <w:left w:val="single" w:color="CCCCCC" w:sz="1"/>
+              <w:bottom w:val="single" w:color="CCCCCC" w:sz="1"/>
+              <w:right w:val="single" w:color="CCCCCC" w:sz="1"/>
+            </w:tcBorders>
+            <w:shd w:fill="FFFFFF" w:val="clear"/>
+            <w:tcMar>
+              <w:top w:type="dxa" w:w="60"/>
+              <w:left w:type="dxa" w:w="120"/>
+              <w:bottom w:type="dxa" w:w="60"/>
+              <w:right w:type="dxa" w:w="120"/>
+            </w:tcMar>
+          </w:tcPr>
+          <w:p>
+            <w:r>
+              <w:rPr>
+                <w:rFonts w:ascii="Arial" w:cs="Arial" w:eastAsia="Arial" w:hAnsi="Arial"/>
+                <w:sz w:val="20"/>
+                <w:szCs w:val="20"/>
+              </w:rPr>
+              <w:t xml:space="preserve">Normalisation StandardScaler sur 16 colonnes numériques</w:t>
+            </w:r>
+          </w:p>
+        </w:tc>
+      </w:tr>
+      <w:tr>
+        <w:tc>
+          <w:tcPr>
+            <w:tcW w:type="dxa" w:w="600"/>
+            <w:tcBorders>
+              <w:top w:val="single" w:color="CCCCCC" w:sz="1"/>
+              <w:left w:val="single" w:color="CCCCCC" w:sz="1"/>
+              <w:bottom w:val="single" w:color="CCCCCC" w:sz="1"/>
+              <w:right w:val="single" w:color="CCCCCC" w:sz="1"/>
+            </w:tcBorders>
+            <w:shd w:fill="F5F8FC" w:val="clear"/>
+            <w:tcMar>
+              <w:top w:type="dxa" w:w="60"/>
+              <w:left w:type="dxa" w:w="120"/>
+              <w:bottom w:type="dxa" w:w="60"/>
+              <w:right w:type="dxa" w:w="120"/>
+            </w:tcMar>
+          </w:tcPr>
+          <w:p>
+            <w:r>
+              <w:rPr>
+                <w:rFonts w:ascii="Arial" w:cs="Arial" w:eastAsia="Arial" w:hAnsi="Arial"/>
+                <w:sz w:val="20"/>
+                <w:szCs w:val="20"/>
+              </w:rPr>
+              <w:t xml:space="preserve">9</w:t>
+            </w:r>
+          </w:p>
+        </w:tc>
+        <w:tc>
+          <w:tcPr>
+            <w:tcW w:type="dxa" w:w="2400"/>
+            <w:tcBorders>
+              <w:top w:val="single" w:color="CCCCCC" w:sz="1"/>
+              <w:left w:val="single" w:color="CCCCCC" w:sz="1"/>
+              <w:bottom w:val="single" w:color="CCCCCC" w:sz="1"/>
+              <w:right w:val="single" w:color="CCCCCC" w:sz="1"/>
+            </w:tcBorders>
+            <w:shd w:fill="F5F8FC" w:val="clear"/>
+            <w:tcMar>
+              <w:top w:type="dxa" w:w="60"/>
+              <w:left w:type="dxa" w:w="120"/>
+              <w:bottom w:type="dxa" w:w="60"/>
+              <w:right w:type="dxa" w:w="120"/>
+            </w:tcMar>
+          </w:tcPr>
+          <w:p>
+            <w:r>
+              <w:rPr>
+                <w:rFonts w:ascii="Arial" w:cs="Arial" w:eastAsia="Arial" w:hAnsi="Arial"/>
+                <w:sz w:val="20"/>
+                <w:szCs w:val="20"/>
+              </w:rPr>
               <w:t xml:space="preserve">Sauvegarde</w:t>
             </w:r>
           </w:p>
         </w:tc>
         <w:tc>
           <w:tcPr>
-            <w:tcW w:type="dxa" w:w="5226"/>
-            <w:tcBorders>
-              <w:top w:val="single" w:color="CCCCCC" w:sz="1"/>
-              <w:left w:val="single" w:color="CCCCCC" w:sz="1"/>
-              <w:bottom w:val="single" w:color="CCCCCC" w:sz="1"/>
-              <w:right w:val="single" w:color="CCCCCC" w:sz="1"/>
-            </w:tcBorders>
-            <w:shd w:fill="FFFFFF" w:val="clear"/>
+            <w:tcW w:type="dxa" w:w="6026"/>
+            <w:tcBorders>
+              <w:top w:val="single" w:color="CCCCCC" w:sz="1"/>
+              <w:left w:val="single" w:color="CCCCCC" w:sz="1"/>
+              <w:bottom w:val="single" w:color="CCCCCC" w:sz="1"/>
+              <w:right w:val="single" w:color="CCCCCC" w:sz="1"/>
+            </w:tcBorders>
+            <w:shd w:fill="F5F8FC" w:val="clear"/>
             <w:tcMar>
               <w:top w:type="dxa" w:w="60"/>
               <w:left w:type="dxa" w:w="120"/>
@@ -965,7 +1051,7 @@
     </w:tbl>
     <w:p>
       <w:pPr>
-        <w:spacing w:after="80" w:before="160"/>
+        <w:spacing w:after="80" w:before="80"/>
       </w:pPr>
     </w:p>
     <w:p>
@@ -999,7 +1085,7 @@
           <w:sz w:val="26"/>
           <w:szCs w:val="26"/>
         </w:rPr>
-        <w:t xml:space="preserve">3.1 Chargement des données</w:t>
+        <w:t xml:space="preserve">3.1 Acquisition — Chargement des données</w:t>
       </w:r>
     </w:p>
     <w:p>
@@ -1012,7 +1098,7 @@
           <w:sz w:val="22"/>
           <w:szCs w:val="22"/>
         </w:rPr>
-        <w:t xml:space="preserve">Lecture du fichier source avec séparateur virgule. Vérification immédiate de l'absence de valeurs manquantes.</w:t>
+        <w:t xml:space="preserve">Lecture du fichier source avec séparateur virgule via pandas.read_csv(). Vérification immédiate de l'absence de valeurs manquantes.</w:t>
       </w:r>
     </w:p>
     <w:p>
@@ -1042,8 +1128,6 @@
       <w:r>
         <w:rPr>
           <w:rFonts w:ascii="Arial" w:cs="Arial" w:eastAsia="Arial" w:hAnsi="Arial"/>
-          <w:b w:val="false"/>
-          <w:bCs w:val="false"/>
           <w:sz w:val="22"/>
           <w:szCs w:val="22"/>
         </w:rPr>
@@ -1062,8 +1146,6 @@
       <w:r>
         <w:rPr>
           <w:rFonts w:ascii="Arial" w:cs="Arial" w:eastAsia="Arial" w:hAnsi="Arial"/>
-          <w:b w:val="false"/>
-          <w:bCs w:val="false"/>
           <w:sz w:val="22"/>
           <w:szCs w:val="22"/>
         </w:rPr>
@@ -1089,7 +1171,7 @@
           <w:sz w:val="26"/>
           <w:szCs w:val="26"/>
         </w:rPr>
-        <w:t xml:space="preserve">3.2 Suppression de policy_id</w:t>
+        <w:t xml:space="preserve">3.2 Contrôle qualité</w:t>
       </w:r>
     </w:p>
     <w:p>
@@ -1102,7 +1184,1129 @@
           <w:sz w:val="22"/>
           <w:szCs w:val="22"/>
         </w:rPr>
-        <w:t xml:space="preserve">L'identifiant unique de chaque police ne contient aucune information prédictive sur le risque. Le conserver introduirait du surapprentissage sur l'identifiant et poserait un problème de confidentialité.</w:t>
+        <w:t xml:space="preserve">Cette étape est nouvelle par rapport à la version initiale. Elle garantit la fiabilité des données avant toute transformation.</w:t>
+      </w:r>
+    </w:p>
+    <w:p>
+      <w:pPr>
+        <w:spacing w:after="80" w:before="80"/>
+      </w:pPr>
+    </w:p>
+    <w:tbl>
+      <w:tblPr>
+        <w:tblW w:type="dxa" w:w="9026"/>
+        <w:tblBorders>
+          <w:top w:val="single" w:color="auto" w:sz="4"/>
+          <w:left w:val="single" w:color="auto" w:sz="4"/>
+          <w:bottom w:val="single" w:color="auto" w:sz="4"/>
+          <w:right w:val="single" w:color="auto" w:sz="4"/>
+          <w:insideH w:val="single" w:color="auto" w:sz="4"/>
+          <w:insideV w:val="single" w:color="auto" w:sz="4"/>
+        </w:tblBorders>
+      </w:tblPr>
+      <w:tblGrid>
+        <w:gridCol w:w="3000"/>
+        <w:gridCol w:w="2500"/>
+        <w:gridCol w:w="3526"/>
+      </w:tblGrid>
+      <w:tr>
+        <w:trPr>
+          <w:tblHeader/>
+        </w:trPr>
+        <w:tc>
+          <w:tcPr>
+            <w:tcW w:type="dxa" w:w="3000"/>
+            <w:tcBorders>
+              <w:top w:val="single" w:color="1F4E79" w:sz="1"/>
+              <w:left w:val="single" w:color="1F4E79" w:sz="1"/>
+              <w:bottom w:val="single" w:color="1F4E79" w:sz="1"/>
+              <w:right w:val="single" w:color="1F4E79" w:sz="1"/>
+            </w:tcBorders>
+            <w:shd w:fill="1F4E79" w:val="clear"/>
+            <w:tcMar>
+              <w:top w:type="dxa" w:w="80"/>
+              <w:left w:type="dxa" w:w="120"/>
+              <w:bottom w:type="dxa" w:w="80"/>
+              <w:right w:type="dxa" w:w="120"/>
+            </w:tcMar>
+          </w:tcPr>
+          <w:p>
+            <w:r>
+              <w:rPr>
+                <w:rFonts w:ascii="Arial" w:cs="Arial" w:eastAsia="Arial" w:hAnsi="Arial"/>
+                <w:b/>
+                <w:bCs/>
+                <w:color w:val="FFFFFF"/>
+                <w:sz w:val="20"/>
+                <w:szCs w:val="20"/>
+              </w:rPr>
+              <w:t xml:space="preserve">Vérification</w:t>
+            </w:r>
+          </w:p>
+        </w:tc>
+        <w:tc>
+          <w:tcPr>
+            <w:tcW w:type="dxa" w:w="2500"/>
+            <w:tcBorders>
+              <w:top w:val="single" w:color="1F4E79" w:sz="1"/>
+              <w:left w:val="single" w:color="1F4E79" w:sz="1"/>
+              <w:bottom w:val="single" w:color="1F4E79" w:sz="1"/>
+              <w:right w:val="single" w:color="1F4E79" w:sz="1"/>
+            </w:tcBorders>
+            <w:shd w:fill="1F4E79" w:val="clear"/>
+            <w:tcMar>
+              <w:top w:type="dxa" w:w="80"/>
+              <w:left w:type="dxa" w:w="120"/>
+              <w:bottom w:type="dxa" w:w="80"/>
+              <w:right w:type="dxa" w:w="120"/>
+            </w:tcMar>
+          </w:tcPr>
+          <w:p>
+            <w:r>
+              <w:rPr>
+                <w:rFonts w:ascii="Arial" w:cs="Arial" w:eastAsia="Arial" w:hAnsi="Arial"/>
+                <w:b/>
+                <w:bCs/>
+                <w:color w:val="FFFFFF"/>
+                <w:sz w:val="20"/>
+                <w:szCs w:val="20"/>
+              </w:rPr>
+              <w:t xml:space="preserve">Résultat</w:t>
+            </w:r>
+          </w:p>
+        </w:tc>
+        <w:tc>
+          <w:tcPr>
+            <w:tcW w:type="dxa" w:w="3526"/>
+            <w:tcBorders>
+              <w:top w:val="single" w:color="1F4E79" w:sz="1"/>
+              <w:left w:val="single" w:color="1F4E79" w:sz="1"/>
+              <w:bottom w:val="single" w:color="1F4E79" w:sz="1"/>
+              <w:right w:val="single" w:color="1F4E79" w:sz="1"/>
+            </w:tcBorders>
+            <w:shd w:fill="1F4E79" w:val="clear"/>
+            <w:tcMar>
+              <w:top w:type="dxa" w:w="80"/>
+              <w:left w:type="dxa" w:w="120"/>
+              <w:bottom w:type="dxa" w:w="80"/>
+              <w:right w:type="dxa" w:w="120"/>
+            </w:tcMar>
+          </w:tcPr>
+          <w:p>
+            <w:r>
+              <w:rPr>
+                <w:rFonts w:ascii="Arial" w:cs="Arial" w:eastAsia="Arial" w:hAnsi="Arial"/>
+                <w:b/>
+                <w:bCs/>
+                <w:color w:val="FFFFFF"/>
+                <w:sz w:val="20"/>
+                <w:szCs w:val="20"/>
+              </w:rPr>
+              <w:t xml:space="preserve">Action</w:t>
+            </w:r>
+          </w:p>
+        </w:tc>
+      </w:tr>
+      <w:tr>
+        <w:tc>
+          <w:tcPr>
+            <w:tcW w:type="dxa" w:w="3000"/>
+            <w:tcBorders>
+              <w:top w:val="single" w:color="CCCCCC" w:sz="1"/>
+              <w:left w:val="single" w:color="CCCCCC" w:sz="1"/>
+              <w:bottom w:val="single" w:color="CCCCCC" w:sz="1"/>
+              <w:right w:val="single" w:color="CCCCCC" w:sz="1"/>
+            </w:tcBorders>
+            <w:shd w:fill="F5F8FC" w:val="clear"/>
+            <w:tcMar>
+              <w:top w:type="dxa" w:w="60"/>
+              <w:left w:type="dxa" w:w="120"/>
+              <w:bottom w:type="dxa" w:w="60"/>
+              <w:right w:type="dxa" w:w="120"/>
+            </w:tcMar>
+          </w:tcPr>
+          <w:p>
+            <w:r>
+              <w:rPr>
+                <w:rFonts w:ascii="Arial" w:cs="Arial" w:eastAsia="Arial" w:hAnsi="Arial"/>
+                <w:sz w:val="20"/>
+                <w:szCs w:val="20"/>
+              </w:rPr>
+              <w:t xml:space="preserve">Doublons</w:t>
+            </w:r>
+          </w:p>
+        </w:tc>
+        <w:tc>
+          <w:tcPr>
+            <w:tcW w:type="dxa" w:w="2500"/>
+            <w:tcBorders>
+              <w:top w:val="single" w:color="CCCCCC" w:sz="1"/>
+              <w:left w:val="single" w:color="CCCCCC" w:sz="1"/>
+              <w:bottom w:val="single" w:color="CCCCCC" w:sz="1"/>
+              <w:right w:val="single" w:color="CCCCCC" w:sz="1"/>
+            </w:tcBorders>
+            <w:shd w:fill="F5F8FC" w:val="clear"/>
+            <w:tcMar>
+              <w:top w:type="dxa" w:w="60"/>
+              <w:left w:type="dxa" w:w="120"/>
+              <w:bottom w:type="dxa" w:w="60"/>
+              <w:right w:type="dxa" w:w="120"/>
+            </w:tcMar>
+          </w:tcPr>
+          <w:p>
+            <w:r>
+              <w:rPr>
+                <w:rFonts w:ascii="Arial" w:cs="Arial" w:eastAsia="Arial" w:hAnsi="Arial"/>
+                <w:sz w:val="20"/>
+                <w:szCs w:val="20"/>
+              </w:rPr>
+              <w:t xml:space="preserve">0 doublon détecté</w:t>
+            </w:r>
+          </w:p>
+        </w:tc>
+        <w:tc>
+          <w:tcPr>
+            <w:tcW w:type="dxa" w:w="3526"/>
+            <w:tcBorders>
+              <w:top w:val="single" w:color="CCCCCC" w:sz="1"/>
+              <w:left w:val="single" w:color="CCCCCC" w:sz="1"/>
+              <w:bottom w:val="single" w:color="CCCCCC" w:sz="1"/>
+              <w:right w:val="single" w:color="CCCCCC" w:sz="1"/>
+            </w:tcBorders>
+            <w:shd w:fill="F5F8FC" w:val="clear"/>
+            <w:tcMar>
+              <w:top w:type="dxa" w:w="60"/>
+              <w:left w:type="dxa" w:w="120"/>
+              <w:bottom w:type="dxa" w:w="60"/>
+              <w:right w:type="dxa" w:w="120"/>
+            </w:tcMar>
+          </w:tcPr>
+          <w:p>
+            <w:r>
+              <w:rPr>
+                <w:rFonts w:ascii="Arial" w:cs="Arial" w:eastAsia="Arial" w:hAnsi="Arial"/>
+                <w:sz w:val="20"/>
+                <w:szCs w:val="20"/>
+              </w:rPr>
+              <w:t xml:space="preserve">Aucune suppression nécessaire</w:t>
+            </w:r>
+          </w:p>
+        </w:tc>
+      </w:tr>
+      <w:tr>
+        <w:tc>
+          <w:tcPr>
+            <w:tcW w:type="dxa" w:w="3000"/>
+            <w:tcBorders>
+              <w:top w:val="single" w:color="CCCCCC" w:sz="1"/>
+              <w:left w:val="single" w:color="CCCCCC" w:sz="1"/>
+              <w:bottom w:val="single" w:color="CCCCCC" w:sz="1"/>
+              <w:right w:val="single" w:color="CCCCCC" w:sz="1"/>
+            </w:tcBorders>
+            <w:shd w:fill="FFFFFF" w:val="clear"/>
+            <w:tcMar>
+              <w:top w:type="dxa" w:w="60"/>
+              <w:left w:type="dxa" w:w="120"/>
+              <w:bottom w:type="dxa" w:w="60"/>
+              <w:right w:type="dxa" w:w="120"/>
+            </w:tcMar>
+          </w:tcPr>
+          <w:p>
+            <w:r>
+              <w:rPr>
+                <w:rFonts w:ascii="Arial" w:cs="Arial" w:eastAsia="Arial" w:hAnsi="Arial"/>
+                <w:sz w:val="20"/>
+                <w:szCs w:val="20"/>
+              </w:rPr>
+              <w:t xml:space="preserve">Valeurs manquantes</w:t>
+            </w:r>
+          </w:p>
+        </w:tc>
+        <w:tc>
+          <w:tcPr>
+            <w:tcW w:type="dxa" w:w="2500"/>
+            <w:tcBorders>
+              <w:top w:val="single" w:color="CCCCCC" w:sz="1"/>
+              <w:left w:val="single" w:color="CCCCCC" w:sz="1"/>
+              <w:bottom w:val="single" w:color="CCCCCC" w:sz="1"/>
+              <w:right w:val="single" w:color="CCCCCC" w:sz="1"/>
+            </w:tcBorders>
+            <w:shd w:fill="FFFFFF" w:val="clear"/>
+            <w:tcMar>
+              <w:top w:type="dxa" w:w="60"/>
+              <w:left w:type="dxa" w:w="120"/>
+              <w:bottom w:type="dxa" w:w="60"/>
+              <w:right w:type="dxa" w:w="120"/>
+            </w:tcMar>
+          </w:tcPr>
+          <w:p>
+            <w:r>
+              <w:rPr>
+                <w:rFonts w:ascii="Arial" w:cs="Arial" w:eastAsia="Arial" w:hAnsi="Arial"/>
+                <w:sz w:val="20"/>
+                <w:szCs w:val="20"/>
+              </w:rPr>
+              <w:t xml:space="preserve">0 valeur manquante</w:t>
+            </w:r>
+          </w:p>
+        </w:tc>
+        <w:tc>
+          <w:tcPr>
+            <w:tcW w:type="dxa" w:w="3526"/>
+            <w:tcBorders>
+              <w:top w:val="single" w:color="CCCCCC" w:sz="1"/>
+              <w:left w:val="single" w:color="CCCCCC" w:sz="1"/>
+              <w:bottom w:val="single" w:color="CCCCCC" w:sz="1"/>
+              <w:right w:val="single" w:color="CCCCCC" w:sz="1"/>
+            </w:tcBorders>
+            <w:shd w:fill="FFFFFF" w:val="clear"/>
+            <w:tcMar>
+              <w:top w:type="dxa" w:w="60"/>
+              <w:left w:type="dxa" w:w="120"/>
+              <w:bottom w:type="dxa" w:w="60"/>
+              <w:right w:type="dxa" w:w="120"/>
+            </w:tcMar>
+          </w:tcPr>
+          <w:p>
+            <w:r>
+              <w:rPr>
+                <w:rFonts w:ascii="Arial" w:cs="Arial" w:eastAsia="Arial" w:hAnsi="Arial"/>
+                <w:sz w:val="20"/>
+                <w:szCs w:val="20"/>
+              </w:rPr>
+              <w:t xml:space="preserve">Aucune imputation nécessaire</w:t>
+            </w:r>
+          </w:p>
+        </w:tc>
+      </w:tr>
+      <w:tr>
+        <w:tc>
+          <w:tcPr>
+            <w:tcW w:type="dxa" w:w="3000"/>
+            <w:tcBorders>
+              <w:top w:val="single" w:color="CCCCCC" w:sz="1"/>
+              <w:left w:val="single" w:color="CCCCCC" w:sz="1"/>
+              <w:bottom w:val="single" w:color="CCCCCC" w:sz="1"/>
+              <w:right w:val="single" w:color="CCCCCC" w:sz="1"/>
+            </w:tcBorders>
+            <w:shd w:fill="F5F8FC" w:val="clear"/>
+            <w:tcMar>
+              <w:top w:type="dxa" w:w="60"/>
+              <w:left w:type="dxa" w:w="120"/>
+              <w:bottom w:type="dxa" w:w="60"/>
+              <w:right w:type="dxa" w:w="120"/>
+            </w:tcMar>
+          </w:tcPr>
+          <w:p>
+            <w:r>
+              <w:rPr>
+                <w:rFonts w:ascii="Arial" w:cs="Arial" w:eastAsia="Arial" w:hAnsi="Arial"/>
+                <w:sz w:val="20"/>
+                <w:szCs w:val="20"/>
+              </w:rPr>
+              <w:t xml:space="preserve">customer_age</w:t>
+            </w:r>
+          </w:p>
+        </w:tc>
+        <w:tc>
+          <w:tcPr>
+            <w:tcW w:type="dxa" w:w="2500"/>
+            <w:tcBorders>
+              <w:top w:val="single" w:color="CCCCCC" w:sz="1"/>
+              <w:left w:val="single" w:color="CCCCCC" w:sz="1"/>
+              <w:bottom w:val="single" w:color="CCCCCC" w:sz="1"/>
+              <w:right w:val="single" w:color="CCCCCC" w:sz="1"/>
+            </w:tcBorders>
+            <w:shd w:fill="F5F8FC" w:val="clear"/>
+            <w:tcMar>
+              <w:top w:type="dxa" w:w="60"/>
+              <w:left w:type="dxa" w:w="120"/>
+              <w:bottom w:type="dxa" w:w="60"/>
+              <w:right w:type="dxa" w:w="120"/>
+            </w:tcMar>
+          </w:tcPr>
+          <w:p>
+            <w:r>
+              <w:rPr>
+                <w:rFonts w:ascii="Arial" w:cs="Arial" w:eastAsia="Arial" w:hAnsi="Arial"/>
+                <w:sz w:val="20"/>
+                <w:szCs w:val="20"/>
+              </w:rPr>
+              <w:t xml:space="preserve">[35 – 75] ans</w:t>
+            </w:r>
+          </w:p>
+        </w:tc>
+        <w:tc>
+          <w:tcPr>
+            <w:tcW w:type="dxa" w:w="3526"/>
+            <w:tcBorders>
+              <w:top w:val="single" w:color="CCCCCC" w:sz="1"/>
+              <w:left w:val="single" w:color="CCCCCC" w:sz="1"/>
+              <w:bottom w:val="single" w:color="CCCCCC" w:sz="1"/>
+              <w:right w:val="single" w:color="CCCCCC" w:sz="1"/>
+            </w:tcBorders>
+            <w:shd w:fill="F5F8FC" w:val="clear"/>
+            <w:tcMar>
+              <w:top w:type="dxa" w:w="60"/>
+              <w:left w:type="dxa" w:w="120"/>
+              <w:bottom w:type="dxa" w:w="60"/>
+              <w:right w:type="dxa" w:w="120"/>
+            </w:tcMar>
+          </w:tcPr>
+          <w:p>
+            <w:r>
+              <w:rPr>
+                <w:rFonts w:ascii="Arial" w:cs="Arial" w:eastAsia="Arial" w:hAnsi="Arial"/>
+                <w:sz w:val="20"/>
+                <w:szCs w:val="20"/>
+              </w:rPr>
+              <w:t xml:space="preserve">Cohérent — aucune anomalie</w:t>
+            </w:r>
+          </w:p>
+        </w:tc>
+      </w:tr>
+      <w:tr>
+        <w:tc>
+          <w:tcPr>
+            <w:tcW w:type="dxa" w:w="3000"/>
+            <w:tcBorders>
+              <w:top w:val="single" w:color="CCCCCC" w:sz="1"/>
+              <w:left w:val="single" w:color="CCCCCC" w:sz="1"/>
+              <w:bottom w:val="single" w:color="CCCCCC" w:sz="1"/>
+              <w:right w:val="single" w:color="CCCCCC" w:sz="1"/>
+            </w:tcBorders>
+            <w:shd w:fill="FFFFFF" w:val="clear"/>
+            <w:tcMar>
+              <w:top w:type="dxa" w:w="60"/>
+              <w:left w:type="dxa" w:w="120"/>
+              <w:bottom w:type="dxa" w:w="60"/>
+              <w:right w:type="dxa" w:w="120"/>
+            </w:tcMar>
+          </w:tcPr>
+          <w:p>
+            <w:r>
+              <w:rPr>
+                <w:rFonts w:ascii="Arial" w:cs="Arial" w:eastAsia="Arial" w:hAnsi="Arial"/>
+                <w:sz w:val="20"/>
+                <w:szCs w:val="20"/>
+              </w:rPr>
+              <w:t xml:space="preserve">vehicle_age</w:t>
+            </w:r>
+          </w:p>
+        </w:tc>
+        <w:tc>
+          <w:tcPr>
+            <w:tcW w:type="dxa" w:w="2500"/>
+            <w:tcBorders>
+              <w:top w:val="single" w:color="CCCCCC" w:sz="1"/>
+              <w:left w:val="single" w:color="CCCCCC" w:sz="1"/>
+              <w:bottom w:val="single" w:color="CCCCCC" w:sz="1"/>
+              <w:right w:val="single" w:color="CCCCCC" w:sz="1"/>
+            </w:tcBorders>
+            <w:shd w:fill="FFFFFF" w:val="clear"/>
+            <w:tcMar>
+              <w:top w:type="dxa" w:w="60"/>
+              <w:left w:type="dxa" w:w="120"/>
+              <w:bottom w:type="dxa" w:w="60"/>
+              <w:right w:type="dxa" w:w="120"/>
+            </w:tcMar>
+          </w:tcPr>
+          <w:p>
+            <w:r>
+              <w:rPr>
+                <w:rFonts w:ascii="Arial" w:cs="Arial" w:eastAsia="Arial" w:hAnsi="Arial"/>
+                <w:sz w:val="20"/>
+                <w:szCs w:val="20"/>
+              </w:rPr>
+              <w:t xml:space="preserve">[0.0 – 20.0] ans</w:t>
+            </w:r>
+          </w:p>
+        </w:tc>
+        <w:tc>
+          <w:tcPr>
+            <w:tcW w:type="dxa" w:w="3526"/>
+            <w:tcBorders>
+              <w:top w:val="single" w:color="CCCCCC" w:sz="1"/>
+              <w:left w:val="single" w:color="CCCCCC" w:sz="1"/>
+              <w:bottom w:val="single" w:color="CCCCCC" w:sz="1"/>
+              <w:right w:val="single" w:color="CCCCCC" w:sz="1"/>
+            </w:tcBorders>
+            <w:shd w:fill="FFFFFF" w:val="clear"/>
+            <w:tcMar>
+              <w:top w:type="dxa" w:w="60"/>
+              <w:left w:type="dxa" w:w="120"/>
+              <w:bottom w:type="dxa" w:w="60"/>
+              <w:right w:type="dxa" w:w="120"/>
+            </w:tcMar>
+          </w:tcPr>
+          <w:p>
+            <w:r>
+              <w:rPr>
+                <w:rFonts w:ascii="Arial" w:cs="Arial" w:eastAsia="Arial" w:hAnsi="Arial"/>
+                <w:sz w:val="20"/>
+                <w:szCs w:val="20"/>
+              </w:rPr>
+              <w:t xml:space="preserve">Cohérent — aucune anomalie</w:t>
+            </w:r>
+          </w:p>
+        </w:tc>
+      </w:tr>
+      <w:tr>
+        <w:tc>
+          <w:tcPr>
+            <w:tcW w:type="dxa" w:w="3000"/>
+            <w:tcBorders>
+              <w:top w:val="single" w:color="CCCCCC" w:sz="1"/>
+              <w:left w:val="single" w:color="CCCCCC" w:sz="1"/>
+              <w:bottom w:val="single" w:color="CCCCCC" w:sz="1"/>
+              <w:right w:val="single" w:color="CCCCCC" w:sz="1"/>
+            </w:tcBorders>
+            <w:shd w:fill="F5F8FC" w:val="clear"/>
+            <w:tcMar>
+              <w:top w:type="dxa" w:w="60"/>
+              <w:left w:type="dxa" w:w="120"/>
+              <w:bottom w:type="dxa" w:w="60"/>
+              <w:right w:type="dxa" w:w="120"/>
+            </w:tcMar>
+          </w:tcPr>
+          <w:p>
+            <w:r>
+              <w:rPr>
+                <w:rFonts w:ascii="Arial" w:cs="Arial" w:eastAsia="Arial" w:hAnsi="Arial"/>
+                <w:sz w:val="20"/>
+                <w:szCs w:val="20"/>
+              </w:rPr>
+              <w:t xml:space="preserve">subscription_length</w:t>
+            </w:r>
+          </w:p>
+        </w:tc>
+        <w:tc>
+          <w:tcPr>
+            <w:tcW w:type="dxa" w:w="2500"/>
+            <w:tcBorders>
+              <w:top w:val="single" w:color="CCCCCC" w:sz="1"/>
+              <w:left w:val="single" w:color="CCCCCC" w:sz="1"/>
+              <w:bottom w:val="single" w:color="CCCCCC" w:sz="1"/>
+              <w:right w:val="single" w:color="CCCCCC" w:sz="1"/>
+            </w:tcBorders>
+            <w:shd w:fill="F5F8FC" w:val="clear"/>
+            <w:tcMar>
+              <w:top w:type="dxa" w:w="60"/>
+              <w:left w:type="dxa" w:w="120"/>
+              <w:bottom w:type="dxa" w:w="60"/>
+              <w:right w:type="dxa" w:w="120"/>
+            </w:tcMar>
+          </w:tcPr>
+          <w:p>
+            <w:r>
+              <w:rPr>
+                <w:rFonts w:ascii="Arial" w:cs="Arial" w:eastAsia="Arial" w:hAnsi="Arial"/>
+                <w:sz w:val="20"/>
+                <w:szCs w:val="20"/>
+              </w:rPr>
+              <w:t xml:space="preserve">[0.0 – 14.0] ans</w:t>
+            </w:r>
+          </w:p>
+        </w:tc>
+        <w:tc>
+          <w:tcPr>
+            <w:tcW w:type="dxa" w:w="3526"/>
+            <w:tcBorders>
+              <w:top w:val="single" w:color="CCCCCC" w:sz="1"/>
+              <w:left w:val="single" w:color="CCCCCC" w:sz="1"/>
+              <w:bottom w:val="single" w:color="CCCCCC" w:sz="1"/>
+              <w:right w:val="single" w:color="CCCCCC" w:sz="1"/>
+            </w:tcBorders>
+            <w:shd w:fill="F5F8FC" w:val="clear"/>
+            <w:tcMar>
+              <w:top w:type="dxa" w:w="60"/>
+              <w:left w:type="dxa" w:w="120"/>
+              <w:bottom w:type="dxa" w:w="60"/>
+              <w:right w:type="dxa" w:w="120"/>
+            </w:tcMar>
+          </w:tcPr>
+          <w:p>
+            <w:r>
+              <w:rPr>
+                <w:rFonts w:ascii="Arial" w:cs="Arial" w:eastAsia="Arial" w:hAnsi="Arial"/>
+                <w:sz w:val="20"/>
+                <w:szCs w:val="20"/>
+              </w:rPr>
+              <w:t xml:space="preserve">Cohérent — aucune anomalie</w:t>
+            </w:r>
+          </w:p>
+        </w:tc>
+      </w:tr>
+      <w:tr>
+        <w:tc>
+          <w:tcPr>
+            <w:tcW w:type="dxa" w:w="3000"/>
+            <w:tcBorders>
+              <w:top w:val="single" w:color="CCCCCC" w:sz="1"/>
+              <w:left w:val="single" w:color="CCCCCC" w:sz="1"/>
+              <w:bottom w:val="single" w:color="CCCCCC" w:sz="1"/>
+              <w:right w:val="single" w:color="CCCCCC" w:sz="1"/>
+            </w:tcBorders>
+            <w:shd w:fill="FFFFFF" w:val="clear"/>
+            <w:tcMar>
+              <w:top w:type="dxa" w:w="60"/>
+              <w:left w:type="dxa" w:w="120"/>
+              <w:bottom w:type="dxa" w:w="60"/>
+              <w:right w:type="dxa" w:w="120"/>
+            </w:tcMar>
+          </w:tcPr>
+          <w:p>
+            <w:r>
+              <w:rPr>
+                <w:rFonts w:ascii="Arial" w:cs="Arial" w:eastAsia="Arial" w:hAnsi="Arial"/>
+                <w:sz w:val="20"/>
+                <w:szCs w:val="20"/>
+              </w:rPr>
+              <w:t xml:space="preserve">region_density</w:t>
+            </w:r>
+          </w:p>
+        </w:tc>
+        <w:tc>
+          <w:tcPr>
+            <w:tcW w:type="dxa" w:w="2500"/>
+            <w:tcBorders>
+              <w:top w:val="single" w:color="CCCCCC" w:sz="1"/>
+              <w:left w:val="single" w:color="CCCCCC" w:sz="1"/>
+              <w:bottom w:val="single" w:color="CCCCCC" w:sz="1"/>
+              <w:right w:val="single" w:color="CCCCCC" w:sz="1"/>
+            </w:tcBorders>
+            <w:shd w:fill="FFFFFF" w:val="clear"/>
+            <w:tcMar>
+              <w:top w:type="dxa" w:w="60"/>
+              <w:left w:type="dxa" w:w="120"/>
+              <w:bottom w:type="dxa" w:w="60"/>
+              <w:right w:type="dxa" w:w="120"/>
+            </w:tcMar>
+          </w:tcPr>
+          <w:p>
+            <w:r>
+              <w:rPr>
+                <w:rFonts w:ascii="Arial" w:cs="Arial" w:eastAsia="Arial" w:hAnsi="Arial"/>
+                <w:sz w:val="20"/>
+                <w:szCs w:val="20"/>
+              </w:rPr>
+              <w:t xml:space="preserve">[290 – 73 430]</w:t>
+            </w:r>
+          </w:p>
+        </w:tc>
+        <w:tc>
+          <w:tcPr>
+            <w:tcW w:type="dxa" w:w="3526"/>
+            <w:tcBorders>
+              <w:top w:val="single" w:color="CCCCCC" w:sz="1"/>
+              <w:left w:val="single" w:color="CCCCCC" w:sz="1"/>
+              <w:bottom w:val="single" w:color="CCCCCC" w:sz="1"/>
+              <w:right w:val="single" w:color="CCCCCC" w:sz="1"/>
+            </w:tcBorders>
+            <w:shd w:fill="FFFFFF" w:val="clear"/>
+            <w:tcMar>
+              <w:top w:type="dxa" w:w="60"/>
+              <w:left w:type="dxa" w:w="120"/>
+              <w:bottom w:type="dxa" w:w="60"/>
+              <w:right w:type="dxa" w:w="120"/>
+            </w:tcMar>
+          </w:tcPr>
+          <w:p>
+            <w:r>
+              <w:rPr>
+                <w:rFonts w:ascii="Arial" w:cs="Arial" w:eastAsia="Arial" w:hAnsi="Arial"/>
+                <w:sz w:val="20"/>
+                <w:szCs w:val="20"/>
+              </w:rPr>
+              <w:t xml:space="preserve">Cohérent — densités urbaines réelles</w:t>
+            </w:r>
+          </w:p>
+        </w:tc>
+      </w:tr>
+      <w:tr>
+        <w:tc>
+          <w:tcPr>
+            <w:tcW w:type="dxa" w:w="3000"/>
+            <w:tcBorders>
+              <w:top w:val="single" w:color="CCCCCC" w:sz="1"/>
+              <w:left w:val="single" w:color="CCCCCC" w:sz="1"/>
+              <w:bottom w:val="single" w:color="CCCCCC" w:sz="1"/>
+              <w:right w:val="single" w:color="CCCCCC" w:sz="1"/>
+            </w:tcBorders>
+            <w:shd w:fill="F5F8FC" w:val="clear"/>
+            <w:tcMar>
+              <w:top w:type="dxa" w:w="60"/>
+              <w:left w:type="dxa" w:w="120"/>
+              <w:bottom w:type="dxa" w:w="60"/>
+              <w:right w:type="dxa" w:w="120"/>
+            </w:tcMar>
+          </w:tcPr>
+          <w:p>
+            <w:r>
+              <w:rPr>
+                <w:rFonts w:ascii="Arial" w:cs="Arial" w:eastAsia="Arial" w:hAnsi="Arial"/>
+                <w:sz w:val="20"/>
+                <w:szCs w:val="20"/>
+              </w:rPr>
+              <w:t xml:space="preserve">ncap_rating</w:t>
+            </w:r>
+          </w:p>
+        </w:tc>
+        <w:tc>
+          <w:tcPr>
+            <w:tcW w:type="dxa" w:w="2500"/>
+            <w:tcBorders>
+              <w:top w:val="single" w:color="CCCCCC" w:sz="1"/>
+              <w:left w:val="single" w:color="CCCCCC" w:sz="1"/>
+              <w:bottom w:val="single" w:color="CCCCCC" w:sz="1"/>
+              <w:right w:val="single" w:color="CCCCCC" w:sz="1"/>
+            </w:tcBorders>
+            <w:shd w:fill="F5F8FC" w:val="clear"/>
+            <w:tcMar>
+              <w:top w:type="dxa" w:w="60"/>
+              <w:left w:type="dxa" w:w="120"/>
+              <w:bottom w:type="dxa" w:w="60"/>
+              <w:right w:type="dxa" w:w="120"/>
+            </w:tcMar>
+          </w:tcPr>
+          <w:p>
+            <w:r>
+              <w:rPr>
+                <w:rFonts w:ascii="Arial" w:cs="Arial" w:eastAsia="Arial" w:hAnsi="Arial"/>
+                <w:sz w:val="20"/>
+                <w:szCs w:val="20"/>
+              </w:rPr>
+              <w:t xml:space="preserve">[0 – 5]</w:t>
+            </w:r>
+          </w:p>
+        </w:tc>
+        <w:tc>
+          <w:tcPr>
+            <w:tcW w:type="dxa" w:w="3526"/>
+            <w:tcBorders>
+              <w:top w:val="single" w:color="CCCCCC" w:sz="1"/>
+              <w:left w:val="single" w:color="CCCCCC" w:sz="1"/>
+              <w:bottom w:val="single" w:color="CCCCCC" w:sz="1"/>
+              <w:right w:val="single" w:color="CCCCCC" w:sz="1"/>
+            </w:tcBorders>
+            <w:shd w:fill="F5F8FC" w:val="clear"/>
+            <w:tcMar>
+              <w:top w:type="dxa" w:w="60"/>
+              <w:left w:type="dxa" w:w="120"/>
+              <w:bottom w:type="dxa" w:w="60"/>
+              <w:right w:type="dxa" w:w="120"/>
+            </w:tcMar>
+          </w:tcPr>
+          <w:p>
+            <w:r>
+              <w:rPr>
+                <w:rFonts w:ascii="Arial" w:cs="Arial" w:eastAsia="Arial" w:hAnsi="Arial"/>
+                <w:sz w:val="20"/>
+                <w:szCs w:val="20"/>
+              </w:rPr>
+              <w:t xml:space="preserve">Cohérent — notation sécurité standard</w:t>
+            </w:r>
+          </w:p>
+        </w:tc>
+      </w:tr>
+      <w:tr>
+        <w:tc>
+          <w:tcPr>
+            <w:tcW w:type="dxa" w:w="3000"/>
+            <w:tcBorders>
+              <w:top w:val="single" w:color="CCCCCC" w:sz="1"/>
+              <w:left w:val="single" w:color="CCCCCC" w:sz="1"/>
+              <w:bottom w:val="single" w:color="CCCCCC" w:sz="1"/>
+              <w:right w:val="single" w:color="CCCCCC" w:sz="1"/>
+            </w:tcBorders>
+            <w:shd w:fill="FFFFFF" w:val="clear"/>
+            <w:tcMar>
+              <w:top w:type="dxa" w:w="60"/>
+              <w:left w:type="dxa" w:w="120"/>
+              <w:bottom w:type="dxa" w:w="60"/>
+              <w:right w:type="dxa" w:w="120"/>
+            </w:tcMar>
+          </w:tcPr>
+          <w:p>
+            <w:r>
+              <w:rPr>
+                <w:rFonts w:ascii="Arial" w:cs="Arial" w:eastAsia="Arial" w:hAnsi="Arial"/>
+                <w:sz w:val="20"/>
+                <w:szCs w:val="20"/>
+              </w:rPr>
+              <w:t xml:space="preserve">claim_status</w:t>
+            </w:r>
+          </w:p>
+        </w:tc>
+        <w:tc>
+          <w:tcPr>
+            <w:tcW w:type="dxa" w:w="2500"/>
+            <w:tcBorders>
+              <w:top w:val="single" w:color="CCCCCC" w:sz="1"/>
+              <w:left w:val="single" w:color="CCCCCC" w:sz="1"/>
+              <w:bottom w:val="single" w:color="CCCCCC" w:sz="1"/>
+              <w:right w:val="single" w:color="CCCCCC" w:sz="1"/>
+            </w:tcBorders>
+            <w:shd w:fill="FFFFFF" w:val="clear"/>
+            <w:tcMar>
+              <w:top w:type="dxa" w:w="60"/>
+              <w:left w:type="dxa" w:w="120"/>
+              <w:bottom w:type="dxa" w:w="60"/>
+              <w:right w:type="dxa" w:w="120"/>
+            </w:tcMar>
+          </w:tcPr>
+          <w:p>
+            <w:r>
+              <w:rPr>
+                <w:rFonts w:ascii="Arial" w:cs="Arial" w:eastAsia="Arial" w:hAnsi="Arial"/>
+                <w:sz w:val="20"/>
+                <w:szCs w:val="20"/>
+              </w:rPr>
+              <w:t xml:space="preserve">{0, 1} uniquement</w:t>
+            </w:r>
+          </w:p>
+        </w:tc>
+        <w:tc>
+          <w:tcPr>
+            <w:tcW w:type="dxa" w:w="3526"/>
+            <w:tcBorders>
+              <w:top w:val="single" w:color="CCCCCC" w:sz="1"/>
+              <w:left w:val="single" w:color="CCCCCC" w:sz="1"/>
+              <w:bottom w:val="single" w:color="CCCCCC" w:sz="1"/>
+              <w:right w:val="single" w:color="CCCCCC" w:sz="1"/>
+            </w:tcBorders>
+            <w:shd w:fill="FFFFFF" w:val="clear"/>
+            <w:tcMar>
+              <w:top w:type="dxa" w:w="60"/>
+              <w:left w:type="dxa" w:w="120"/>
+              <w:bottom w:type="dxa" w:w="60"/>
+              <w:right w:type="dxa" w:w="120"/>
+            </w:tcMar>
+          </w:tcPr>
+          <w:p>
+            <w:r>
+              <w:rPr>
+                <w:rFonts w:ascii="Arial" w:cs="Arial" w:eastAsia="Arial" w:hAnsi="Arial"/>
+                <w:sz w:val="20"/>
+                <w:szCs w:val="20"/>
+              </w:rPr>
+              <w:t xml:space="preserve">Assertion OK</w:t>
+            </w:r>
+          </w:p>
+        </w:tc>
+      </w:tr>
+      <w:tr>
+        <w:tc>
+          <w:tcPr>
+            <w:tcW w:type="dxa" w:w="3000"/>
+            <w:tcBorders>
+              <w:top w:val="single" w:color="CCCCCC" w:sz="1"/>
+              <w:left w:val="single" w:color="CCCCCC" w:sz="1"/>
+              <w:bottom w:val="single" w:color="CCCCCC" w:sz="1"/>
+              <w:right w:val="single" w:color="CCCCCC" w:sz="1"/>
+            </w:tcBorders>
+            <w:shd w:fill="F5F8FC" w:val="clear"/>
+            <w:tcMar>
+              <w:top w:type="dxa" w:w="60"/>
+              <w:left w:type="dxa" w:w="120"/>
+              <w:bottom w:type="dxa" w:w="60"/>
+              <w:right w:type="dxa" w:w="120"/>
+            </w:tcMar>
+          </w:tcPr>
+          <w:p>
+            <w:r>
+              <w:rPr>
+                <w:rFonts w:ascii="Arial" w:cs="Arial" w:eastAsia="Arial" w:hAnsi="Arial"/>
+                <w:sz w:val="20"/>
+                <w:szCs w:val="20"/>
+              </w:rPr>
+              <w:t xml:space="preserve">Outliers customer_age</w:t>
+            </w:r>
+          </w:p>
+        </w:tc>
+        <w:tc>
+          <w:tcPr>
+            <w:tcW w:type="dxa" w:w="2500"/>
+            <w:tcBorders>
+              <w:top w:val="single" w:color="CCCCCC" w:sz="1"/>
+              <w:left w:val="single" w:color="CCCCCC" w:sz="1"/>
+              <w:bottom w:val="single" w:color="CCCCCC" w:sz="1"/>
+              <w:right w:val="single" w:color="CCCCCC" w:sz="1"/>
+            </w:tcBorders>
+            <w:shd w:fill="F5F8FC" w:val="clear"/>
+            <w:tcMar>
+              <w:top w:type="dxa" w:w="60"/>
+              <w:left w:type="dxa" w:w="120"/>
+              <w:bottom w:type="dxa" w:w="60"/>
+              <w:right w:type="dxa" w:w="120"/>
+            </w:tcMar>
+          </w:tcPr>
+          <w:p>
+            <w:r>
+              <w:rPr>
+                <w:rFonts w:ascii="Arial" w:cs="Arial" w:eastAsia="Arial" w:hAnsi="Arial"/>
+                <w:sz w:val="20"/>
+                <w:szCs w:val="20"/>
+              </w:rPr>
+              <w:t xml:space="preserve">282 (0.5%)</w:t>
+            </w:r>
+          </w:p>
+        </w:tc>
+        <w:tc>
+          <w:tcPr>
+            <w:tcW w:type="dxa" w:w="3526"/>
+            <w:tcBorders>
+              <w:top w:val="single" w:color="CCCCCC" w:sz="1"/>
+              <w:left w:val="single" w:color="CCCCCC" w:sz="1"/>
+              <w:bottom w:val="single" w:color="CCCCCC" w:sz="1"/>
+              <w:right w:val="single" w:color="CCCCCC" w:sz="1"/>
+            </w:tcBorders>
+            <w:shd w:fill="F5F8FC" w:val="clear"/>
+            <w:tcMar>
+              <w:top w:type="dxa" w:w="60"/>
+              <w:left w:type="dxa" w:w="120"/>
+              <w:bottom w:type="dxa" w:w="60"/>
+              <w:right w:type="dxa" w:w="120"/>
+            </w:tcMar>
+          </w:tcPr>
+          <w:p>
+            <w:r>
+              <w:rPr>
+                <w:rFonts w:ascii="Arial" w:cs="Arial" w:eastAsia="Arial" w:hAnsi="Arial"/>
+                <w:sz w:val="20"/>
+                <w:szCs w:val="20"/>
+              </w:rPr>
+              <w:t xml:space="preserve">Conservés — cas réels</w:t>
+            </w:r>
+          </w:p>
+        </w:tc>
+      </w:tr>
+      <w:tr>
+        <w:tc>
+          <w:tcPr>
+            <w:tcW w:type="dxa" w:w="3000"/>
+            <w:tcBorders>
+              <w:top w:val="single" w:color="CCCCCC" w:sz="1"/>
+              <w:left w:val="single" w:color="CCCCCC" w:sz="1"/>
+              <w:bottom w:val="single" w:color="CCCCCC" w:sz="1"/>
+              <w:right w:val="single" w:color="CCCCCC" w:sz="1"/>
+            </w:tcBorders>
+            <w:shd w:fill="FFFFFF" w:val="clear"/>
+            <w:tcMar>
+              <w:top w:type="dxa" w:w="60"/>
+              <w:left w:type="dxa" w:w="120"/>
+              <w:bottom w:type="dxa" w:w="60"/>
+              <w:right w:type="dxa" w:w="120"/>
+            </w:tcMar>
+          </w:tcPr>
+          <w:p>
+            <w:r>
+              <w:rPr>
+                <w:rFonts w:ascii="Arial" w:cs="Arial" w:eastAsia="Arial" w:hAnsi="Arial"/>
+                <w:sz w:val="20"/>
+                <w:szCs w:val="20"/>
+              </w:rPr>
+              <w:t xml:space="preserve">Outliers vehicle_age</w:t>
+            </w:r>
+          </w:p>
+        </w:tc>
+        <w:tc>
+          <w:tcPr>
+            <w:tcW w:type="dxa" w:w="2500"/>
+            <w:tcBorders>
+              <w:top w:val="single" w:color="CCCCCC" w:sz="1"/>
+              <w:left w:val="single" w:color="CCCCCC" w:sz="1"/>
+              <w:bottom w:val="single" w:color="CCCCCC" w:sz="1"/>
+              <w:right w:val="single" w:color="CCCCCC" w:sz="1"/>
+            </w:tcBorders>
+            <w:shd w:fill="FFFFFF" w:val="clear"/>
+            <w:tcMar>
+              <w:top w:type="dxa" w:w="60"/>
+              <w:left w:type="dxa" w:w="120"/>
+              <w:bottom w:type="dxa" w:w="60"/>
+              <w:right w:type="dxa" w:w="120"/>
+            </w:tcMar>
+          </w:tcPr>
+          <w:p>
+            <w:r>
+              <w:rPr>
+                <w:rFonts w:ascii="Arial" w:cs="Arial" w:eastAsia="Arial" w:hAnsi="Arial"/>
+                <w:sz w:val="20"/>
+                <w:szCs w:val="20"/>
+              </w:rPr>
+              <w:t xml:space="preserve">269 (0.5%)</w:t>
+            </w:r>
+          </w:p>
+        </w:tc>
+        <w:tc>
+          <w:tcPr>
+            <w:tcW w:type="dxa" w:w="3526"/>
+            <w:tcBorders>
+              <w:top w:val="single" w:color="CCCCCC" w:sz="1"/>
+              <w:left w:val="single" w:color="CCCCCC" w:sz="1"/>
+              <w:bottom w:val="single" w:color="CCCCCC" w:sz="1"/>
+              <w:right w:val="single" w:color="CCCCCC" w:sz="1"/>
+            </w:tcBorders>
+            <w:shd w:fill="FFFFFF" w:val="clear"/>
+            <w:tcMar>
+              <w:top w:type="dxa" w:w="60"/>
+              <w:left w:type="dxa" w:w="120"/>
+              <w:bottom w:type="dxa" w:w="60"/>
+              <w:right w:type="dxa" w:w="120"/>
+            </w:tcMar>
+          </w:tcPr>
+          <w:p>
+            <w:r>
+              <w:rPr>
+                <w:rFonts w:ascii="Arial" w:cs="Arial" w:eastAsia="Arial" w:hAnsi="Arial"/>
+                <w:sz w:val="20"/>
+                <w:szCs w:val="20"/>
+              </w:rPr>
+              <w:t xml:space="preserve">Conservés — cas réels</w:t>
+            </w:r>
+          </w:p>
+        </w:tc>
+      </w:tr>
+      <w:tr>
+        <w:tc>
+          <w:tcPr>
+            <w:tcW w:type="dxa" w:w="3000"/>
+            <w:tcBorders>
+              <w:top w:val="single" w:color="CCCCCC" w:sz="1"/>
+              <w:left w:val="single" w:color="CCCCCC" w:sz="1"/>
+              <w:bottom w:val="single" w:color="CCCCCC" w:sz="1"/>
+              <w:right w:val="single" w:color="CCCCCC" w:sz="1"/>
+            </w:tcBorders>
+            <w:shd w:fill="F5F8FC" w:val="clear"/>
+            <w:tcMar>
+              <w:top w:type="dxa" w:w="60"/>
+              <w:left w:type="dxa" w:w="120"/>
+              <w:bottom w:type="dxa" w:w="60"/>
+              <w:right w:type="dxa" w:w="120"/>
+            </w:tcMar>
+          </w:tcPr>
+          <w:p>
+            <w:r>
+              <w:rPr>
+                <w:rFonts w:ascii="Arial" w:cs="Arial" w:eastAsia="Arial" w:hAnsi="Arial"/>
+                <w:sz w:val="20"/>
+                <w:szCs w:val="20"/>
+              </w:rPr>
+              <w:t xml:space="preserve">Outliers region_density</w:t>
+            </w:r>
+          </w:p>
+        </w:tc>
+        <w:tc>
+          <w:tcPr>
+            <w:tcW w:type="dxa" w:w="2500"/>
+            <w:tcBorders>
+              <w:top w:val="single" w:color="CCCCCC" w:sz="1"/>
+              <w:left w:val="single" w:color="CCCCCC" w:sz="1"/>
+              <w:bottom w:val="single" w:color="CCCCCC" w:sz="1"/>
+              <w:right w:val="single" w:color="CCCCCC" w:sz="1"/>
+            </w:tcBorders>
+            <w:shd w:fill="F5F8FC" w:val="clear"/>
+            <w:tcMar>
+              <w:top w:type="dxa" w:w="60"/>
+              <w:left w:type="dxa" w:w="120"/>
+              <w:bottom w:type="dxa" w:w="60"/>
+              <w:right w:type="dxa" w:w="120"/>
+            </w:tcMar>
+          </w:tcPr>
+          <w:p>
+            <w:r>
+              <w:rPr>
+                <w:rFonts w:ascii="Arial" w:cs="Arial" w:eastAsia="Arial" w:hAnsi="Arial"/>
+                <w:sz w:val="20"/>
+                <w:szCs w:val="20"/>
+              </w:rPr>
+              <w:t xml:space="preserve">3 647 (6.2%)</w:t>
+            </w:r>
+          </w:p>
+        </w:tc>
+        <w:tc>
+          <w:tcPr>
+            <w:tcW w:type="dxa" w:w="3526"/>
+            <w:tcBorders>
+              <w:top w:val="single" w:color="CCCCCC" w:sz="1"/>
+              <w:left w:val="single" w:color="CCCCCC" w:sz="1"/>
+              <w:bottom w:val="single" w:color="CCCCCC" w:sz="1"/>
+              <w:right w:val="single" w:color="CCCCCC" w:sz="1"/>
+            </w:tcBorders>
+            <w:shd w:fill="F5F8FC" w:val="clear"/>
+            <w:tcMar>
+              <w:top w:type="dxa" w:w="60"/>
+              <w:left w:type="dxa" w:w="120"/>
+              <w:bottom w:type="dxa" w:w="60"/>
+              <w:right w:type="dxa" w:w="120"/>
+            </w:tcMar>
+          </w:tcPr>
+          <w:p>
+            <w:r>
+              <w:rPr>
+                <w:rFonts w:ascii="Arial" w:cs="Arial" w:eastAsia="Arial" w:hAnsi="Arial"/>
+                <w:sz w:val="20"/>
+                <w:szCs w:val="20"/>
+              </w:rPr>
+              <w:t xml:space="preserve">Conservés — densités urbaines extrêmes réelles</w:t>
+            </w:r>
+          </w:p>
+        </w:tc>
+      </w:tr>
+    </w:tbl>
+    <w:p>
+      <w:pPr>
+        <w:spacing w:after="80" w:before="80"/>
+      </w:pPr>
+    </w:p>
+    <w:p>
+      <w:pPr>
+        <w:spacing w:after="80" w:before="80"/>
+      </w:pPr>
+      <w:r>
+        <w:rPr>
+          <w:rFonts w:ascii="Arial" w:cs="Arial" w:eastAsia="Arial" w:hAnsi="Arial"/>
+          <w:i/>
+          <w:iCs/>
+          <w:sz w:val="22"/>
+          <w:szCs w:val="22"/>
+        </w:rPr>
+        <w:t xml:space="preserve">Justification du choix de conserver les outliers : en assurance, les valeurs extrêmes (véhicules très anciens, zones à très forte densité) sont des cas réels et pertinents pour la modélisation actuarielle. Les supprimer biaiserait le modèle vers les profils moyens et dégraderait sa capacité à tarifer les risques atypiques.</w:t>
+      </w:r>
+    </w:p>
+    <w:p>
+      <w:pPr>
+        <w:spacing w:after="80" w:before="80"/>
+      </w:pPr>
+    </w:p>
+    <w:p>
+      <w:pPr>
+        <w:pStyle w:val="Heading2"/>
+        <w:spacing w:after="120" w:before="240"/>
+      </w:pPr>
+      <w:r>
+        <w:rPr>
+          <w:rFonts w:ascii="Arial" w:cs="Arial" w:eastAsia="Arial" w:hAnsi="Arial"/>
+          <w:b/>
+          <w:bCs/>
+          <w:color w:val="2E75B6"/>
+          <w:sz w:val="26"/>
+          <w:szCs w:val="26"/>
+        </w:rPr>
+        <w:t xml:space="preserve">3.3 Préparation — Suppression de policy_id</w:t>
+      </w:r>
+    </w:p>
+    <w:p>
+      <w:pPr>
+        <w:spacing w:after="80" w:before="80"/>
+      </w:pPr>
+      <w:r>
+        <w:rPr>
+          <w:rFonts w:ascii="Arial" w:cs="Arial" w:eastAsia="Arial" w:hAnsi="Arial"/>
+          <w:sz w:val="22"/>
+          <w:szCs w:val="22"/>
+        </w:rPr>
+        <w:t xml:space="preserve">L'identifiant unique de chaque police ne contient aucune information prédictive sur le risque sinistre. Le conserver introduirait du surapprentissage sur l'identifiant et poserait un problème de confidentialité des données.</w:t>
       </w:r>
     </w:p>
     <w:p>
@@ -1132,8 +2336,6 @@
       <w:r>
         <w:rPr>
           <w:rFonts w:ascii="Arial" w:cs="Arial" w:eastAsia="Arial" w:hAnsi="Arial"/>
-          <w:b w:val="false"/>
-          <w:bCs w:val="false"/>
           <w:sz w:val="22"/>
           <w:szCs w:val="22"/>
         </w:rPr>
@@ -1159,7 +2361,7 @@
           <w:sz w:val="26"/>
           <w:szCs w:val="26"/>
         </w:rPr>
-        <w:t xml:space="preserve">3.3 Parsing de max_torque et max_power</w:t>
+        <w:t xml:space="preserve">3.4 Transformation — Parsing de max_torque et max_power</w:t>
       </w:r>
     </w:p>
     <w:p>
@@ -1172,7 +2374,7 @@
           <w:sz w:val="22"/>
           <w:szCs w:val="22"/>
         </w:rPr>
-        <w:t xml:space="preserve">Ces deux colonnes arrivent sous forme de chaînes de caractères non exploitables directement par un modèle :</w:t>
+        <w:t xml:space="preserve">Ces deux colonnes arrivent sous forme de chaînes de caractères non exploitables par un modèle :</w:t>
       </w:r>
     </w:p>
     <w:p>
@@ -1187,8 +2389,6 @@
       <w:r>
         <w:rPr>
           <w:rFonts w:ascii="Arial" w:cs="Arial" w:eastAsia="Arial" w:hAnsi="Arial"/>
-          <w:b w:val="false"/>
-          <w:bCs w:val="false"/>
           <w:sz w:val="22"/>
           <w:szCs w:val="22"/>
         </w:rPr>
@@ -1207,8 +2407,6 @@
       <w:r>
         <w:rPr>
           <w:rFonts w:ascii="Arial" w:cs="Arial" w:eastAsia="Arial" w:hAnsi="Arial"/>
-          <w:b w:val="false"/>
-          <w:bCs w:val="false"/>
           <w:sz w:val="22"/>
           <w:szCs w:val="22"/>
         </w:rPr>
@@ -1225,12 +2423,12 @@
           <w:sz w:val="22"/>
           <w:szCs w:val="22"/>
         </w:rPr>
-        <w:t xml:space="preserve">Des expressions régulières (regex) extraient les valeurs numériques contenues dans ces chaînes, produisant 4 nouvelles colonnes :</w:t>
-      </w:r>
-    </w:p>
-    <w:p>
-      <w:pPr>
-        <w:spacing w:after="120" w:before="120"/>
+        <w:t xml:space="preserve">Des expressions régulières (regex) extraient les valeurs numériques, produisant 4 nouvelles colonnes :</w:t>
+      </w:r>
+    </w:p>
+    <w:p>
+      <w:pPr>
+        <w:spacing w:after="80" w:before="80"/>
       </w:pPr>
     </w:p>
     <w:tbl>
@@ -1708,7 +2906,7 @@
           <w:sz w:val="22"/>
           <w:szCs w:val="22"/>
         </w:rPr>
-        <w:t xml:space="preserve">Les colonnes textuelles originales sont ensuite supprimées. Aucun NaN n'est produit sur le dataset complet.</w:t>
+        <w:t xml:space="preserve">Contrôle post-parsing : 0 NaN produit sur les 58 592 lignes — le format est homogène dans tout le dataset.</w:t>
       </w:r>
     </w:p>
     <w:p>
@@ -1730,7 +2928,7 @@
           <w:sz w:val="26"/>
           <w:szCs w:val="26"/>
         </w:rPr>
-        <w:t xml:space="preserve">3.4 Encodage binaire Yes/No → 0/1</w:t>
+        <w:t xml:space="preserve">3.5 Transformation — Encodage binaire Yes/No → 0/1</w:t>
       </w:r>
     </w:p>
     <w:p>
@@ -1743,7 +2941,7 @@
           <w:sz w:val="22"/>
           <w:szCs w:val="22"/>
         </w:rPr>
-        <w:t xml:space="preserve">17 colonnes représentant des équipements de sécurité sont stockées en texte ("Yes" / "No"). Elles sont converties en entiers 0 et 1 via un mapping explicite.</w:t>
+        <w:t xml:space="preserve">17 colonnes représentent des équipements de sécurité en texte ("Yes" / "No"). Elles sont converties en entiers 0 et 1 via un mapping explicite. Tout algorithme ML/DL attend des valeurs numériques.</w:t>
       </w:r>
     </w:p>
     <w:p>
@@ -1759,19 +2957,6 @@
           <w:szCs w:val="20"/>
         </w:rPr>
         <w:t xml:space="preserve">df[col] = df[col].map({'Yes': 1, 'No': 0})</w:t>
-      </w:r>
-    </w:p>
-    <w:p>
-      <w:pPr>
-        <w:spacing w:after="80" w:before="80"/>
-      </w:pPr>
-      <w:r>
-        <w:rPr>
-          <w:rFonts w:ascii="Arial" w:cs="Arial" w:eastAsia="Arial" w:hAnsi="Arial"/>
-          <w:sz w:val="22"/>
-          <w:szCs w:val="22"/>
-        </w:rPr>
-        <w:t xml:space="preserve">Colonnes concernées :</w:t>
       </w:r>
     </w:p>
     <w:p>
@@ -1786,8 +2971,6 @@
       <w:r>
         <w:rPr>
           <w:rFonts w:ascii="Arial" w:cs="Arial" w:eastAsia="Arial" w:hAnsi="Arial"/>
-          <w:b w:val="false"/>
-          <w:bCs w:val="false"/>
           <w:sz w:val="22"/>
           <w:szCs w:val="22"/>
         </w:rPr>
@@ -1806,8 +2989,6 @@
       <w:r>
         <w:rPr>
           <w:rFonts w:ascii="Arial" w:cs="Arial" w:eastAsia="Arial" w:hAnsi="Arial"/>
-          <w:b w:val="false"/>
-          <w:bCs w:val="false"/>
           <w:sz w:val="22"/>
           <w:szCs w:val="22"/>
         </w:rPr>
@@ -1826,8 +3007,6 @@
       <w:r>
         <w:rPr>
           <w:rFonts w:ascii="Arial" w:cs="Arial" w:eastAsia="Arial" w:hAnsi="Arial"/>
-          <w:b w:val="false"/>
-          <w:bCs w:val="false"/>
           <w:sz w:val="22"/>
           <w:szCs w:val="22"/>
         </w:rPr>
@@ -1846,8 +3025,6 @@
       <w:r>
         <w:rPr>
           <w:rFonts w:ascii="Arial" w:cs="Arial" w:eastAsia="Arial" w:hAnsi="Arial"/>
-          <w:b w:val="false"/>
-          <w:bCs w:val="false"/>
           <w:sz w:val="22"/>
           <w:szCs w:val="22"/>
         </w:rPr>
@@ -1873,7 +3050,7 @@
           <w:sz w:val="26"/>
           <w:szCs w:val="26"/>
         </w:rPr>
-        <w:t xml:space="preserve">3.5 One-hot encoding des variables catégorielles</w:t>
+        <w:t xml:space="preserve">3.6 Transformation — One-hot encoding des variables catégorielles</w:t>
       </w:r>
     </w:p>
     <w:p>
@@ -1886,12 +3063,12 @@
           <w:sz w:val="22"/>
           <w:szCs w:val="22"/>
         </w:rPr>
-        <w:t xml:space="preserve">8 colonnes catégorielles nominales (sans ordre naturel) ne peuvent pas être encodées en entiers séquentiels — cela créerait un ordre fictif que le modèle interpréterait à tort. Le one-hot encoding crée une colonne binaire par modalité.</w:t>
-      </w:r>
-    </w:p>
-    <w:p>
-      <w:pPr>
-        <w:spacing w:after="120" w:before="120"/>
+        <w:t xml:space="preserve">8 colonnes catégorielles nominales ne peuvent pas être encodées en entiers séquentiels — cela créerait un ordre fictif interprété à tort par le modèle. Le one-hot encoding crée une colonne binaire par modalité.</w:t>
+      </w:r>
+    </w:p>
+    <w:p>
+      <w:pPr>
+        <w:spacing w:after="80" w:before="80"/>
       </w:pPr>
     </w:p>
     <w:tbl>
@@ -2479,7 +3656,7 @@
           <w:sz w:val="26"/>
           <w:szCs w:val="26"/>
         </w:rPr>
-        <w:t xml:space="preserve">3.6 Vérification du déséquilibre des classes</w:t>
+        <w:t xml:space="preserve">3.7 Déséquilibre des classes</w:t>
       </w:r>
     </w:p>
     <w:p>
@@ -2492,12 +3669,12 @@
           <w:sz w:val="22"/>
           <w:szCs w:val="22"/>
         </w:rPr>
-        <w:t xml:space="preserve">Cette étape quantifie le déséquilibre qui justifie l'ensemble du projet :</w:t>
-      </w:r>
-    </w:p>
-    <w:p>
-      <w:pPr>
-        <w:spacing w:after="120" w:before="120"/>
+        <w:t xml:space="preserve">Observation centrale qui justifie l'ensemble du projet :</w:t>
+      </w:r>
+    </w:p>
+    <w:p>
+      <w:pPr>
+        <w:spacing w:after="80" w:before="80"/>
       </w:pPr>
     </w:p>
     <w:tbl>
@@ -2889,7 +4066,7 @@
           <w:sz w:val="22"/>
           <w:szCs w:val="22"/>
         </w:rPr>
-        <w:t xml:space="preserve">Un modèle naïf prédisant systématiquement "pas de sinistre" atteindrait 93,6% de précision sans rien apprendre — ce qui est inutile actuariellement. La génération synthétique de l'étape 3 vise à rééquilibrer cet apprentissage.</w:t>
+        <w:t xml:space="preserve">Un modèle naïf prédisant systématiquement "pas de sinistre" atteindrait 93,6% de précision sans rien apprendre. La génération synthétique de l'étape 3 vise à rééquilibrer cet apprentissage.</w:t>
       </w:r>
     </w:p>
     <w:p>
@@ -2911,7 +4088,7 @@
           <w:sz w:val="26"/>
           <w:szCs w:val="26"/>
         </w:rPr>
-        <w:t xml:space="preserve">3.7 Normalisation — StandardScaler</w:t>
+        <w:t xml:space="preserve">3.8 Transformation — Normalisation StandardScaler</w:t>
       </w:r>
     </w:p>
     <w:p>
@@ -2924,26 +4101,8 @@
           <w:sz w:val="22"/>
           <w:szCs w:val="22"/>
         </w:rPr>
-        <w:t xml:space="preserve">15 colonnes numériques continues présentent des échelles très hétérogènes (customer_age : 18-70, region_density : jusqu'à plusieurs milliers, displacement : en cm³). Sans normalisation, les variables à grande échelle dominent l'apprentissage.</w:t>
-      </w:r>
-    </w:p>
-    <w:p>
-      <w:pPr>
-        <w:spacing w:after="80" w:before="80"/>
-      </w:pPr>
-      <w:r>
-        <w:rPr>
-          <w:rFonts w:ascii="Arial" w:cs="Arial" w:eastAsia="Arial" w:hAnsi="Arial"/>
-          <w:sz w:val="22"/>
-          <w:szCs w:val="22"/>
-        </w:rPr>
-        <w:t xml:space="preserve">Le StandardScaler centre chaque variable sur 0 avec un écart-type de 1 :</w:t>
-      </w:r>
-    </w:p>
-    <w:p>
-      <w:pPr>
-        <w:spacing w:after="80" w:before="80"/>
-      </w:pPr>
+        <w:t xml:space="preserve">16 colonnes numériques continues présentent des échelles très hétérogènes. Sans normalisation, les variables à grande échelle dominent l'apprentissage.</w:t>
+      </w:r>
     </w:p>
     <w:p>
       <w:pPr>
@@ -2966,18 +4125,13 @@
       <w:pPr>
         <w:spacing w:after="80" w:before="80"/>
       </w:pPr>
-    </w:p>
-    <w:p>
-      <w:pPr>
-        <w:spacing w:after="80" w:before="80"/>
-      </w:pPr>
       <w:r>
         <w:rPr>
           <w:rFonts w:ascii="Arial" w:cs="Arial" w:eastAsia="Arial" w:hAnsi="Arial"/>
           <w:sz w:val="22"/>
           <w:szCs w:val="22"/>
         </w:rPr>
-        <w:t xml:space="preserve">Colonnes normalisées : subscription_length, vehicle_age, customer_age, region_density, displacement, cylinder, turning_radius, length, width, gross_weight, torque_nm, torque_rpm, power_bhp, power_rpm, airbags.</w:t>
+        <w:t xml:space="preserve">Colonnes normalisées : subscription_length, vehicle_age, customer_age, region_density, displacement, cylinder, turning_radius, length, width, gross_weight, torque_nm, torque_rpm, power_bhp, power_rpm, airbags, ncap_rating.</w:t>
       </w:r>
     </w:p>
     <w:p>
@@ -2990,7 +4144,7 @@
           <w:sz w:val="22"/>
           <w:szCs w:val="22"/>
         </w:rPr>
-        <w:t xml:space="preserve">Important : claim_status n'est pas normalisé — il reste en 0/1.</w:t>
+        <w:t xml:space="preserve">Contrôle post-normalisation : mean ≈ 0.0000, std ≈ 1.0000 pour chaque colonne. claim_status non normalisé — reste en 0/1.</w:t>
       </w:r>
     </w:p>
     <w:p>
@@ -3012,25 +4166,12 @@
           <w:sz w:val="26"/>
           <w:szCs w:val="26"/>
         </w:rPr>
-        <w:t xml:space="preserve">3.8 Sauvegarde — deux fichiers distincts</w:t>
+        <w:t xml:space="preserve">3.9 Sauvegarde — deux fichiers distincts</w:t>
       </w:r>
     </w:p>
     <w:p>
       <w:pPr>
         <w:spacing w:after="80" w:before="80"/>
-      </w:pPr>
-      <w:r>
-        <w:rPr>
-          <w:rFonts w:ascii="Arial" w:cs="Arial" w:eastAsia="Arial" w:hAnsi="Arial"/>
-          <w:sz w:val="22"/>
-          <w:szCs w:val="22"/>
-        </w:rPr>
-        <w:t xml:space="preserve">Deux fichiers sont produits dans le dossier outputs/ pour des usages différents dans les étapes suivantes :</w:t>
-      </w:r>
-    </w:p>
-    <w:p>
-      <w:pPr>
-        <w:spacing w:after="120" w:before="120"/>
       </w:pPr>
     </w:p>
     <w:tbl>
@@ -3323,7 +4464,7 @@
     </w:tbl>
     <w:p>
       <w:pPr>
-        <w:spacing w:after="80" w:before="160"/>
+        <w:spacing w:after="80" w:before="80"/>
       </w:pPr>
     </w:p>
     <w:p>
@@ -3353,7 +4494,7 @@
     </w:p>
     <w:p>
       <w:pPr>
-        <w:spacing w:after="120" w:before="120"/>
+        <w:spacing w:after="80" w:before="80"/>
       </w:pPr>
     </w:p>
     <w:tbl>
@@ -3582,7 +4723,7 @@
                 <w:sz w:val="20"/>
                 <w:szCs w:val="20"/>
               </w:rPr>
-              <w:t xml:space="preserve">Valeurs manquantes</w:t>
+              <w:t xml:space="preserve">Doublons</w:t>
             </w:r>
           </w:p>
         </w:tc>
@@ -3668,7 +4809,7 @@
                 <w:sz w:val="20"/>
                 <w:szCs w:val="20"/>
               </w:rPr>
-              <w:t xml:space="preserve">Variables textuelles</w:t>
+              <w:t xml:space="preserve">Valeurs manquantes</w:t>
             </w:r>
           </w:p>
         </w:tc>
@@ -3696,7 +4837,7 @@
                 <w:sz w:val="20"/>
                 <w:szCs w:val="20"/>
               </w:rPr>
-              <w:t xml:space="preserve">10+</w:t>
+              <w:t xml:space="preserve">0</w:t>
             </w:r>
           </w:p>
         </w:tc>
@@ -3754,7 +4895,7 @@
                 <w:sz w:val="20"/>
                 <w:szCs w:val="20"/>
               </w:rPr>
-              <w:t xml:space="preserve">Variables numériques</w:t>
+              <w:t xml:space="preserve">Variables textuelles</w:t>
             </w:r>
           </w:p>
         </w:tc>
@@ -3782,7 +4923,7 @@
                 <w:sz w:val="20"/>
                 <w:szCs w:val="20"/>
               </w:rPr>
-              <w:t xml:space="preserve">15</w:t>
+              <w:t xml:space="preserve">10+</w:t>
             </w:r>
           </w:p>
         </w:tc>
@@ -3810,7 +4951,7 @@
                 <w:sz w:val="20"/>
                 <w:szCs w:val="20"/>
               </w:rPr>
-              <w:t xml:space="preserve">15 (normalisées)</w:t>
+              <w:t xml:space="preserve">0</w:t>
             </w:r>
           </w:p>
         </w:tc>
@@ -3840,7 +4981,7 @@
                 <w:sz w:val="20"/>
                 <w:szCs w:val="20"/>
               </w:rPr>
-              <w:t xml:space="preserve">Variables binaires</w:t>
+              <w:t xml:space="preserve">Variables numériques continues</w:t>
             </w:r>
           </w:p>
         </w:tc>
@@ -3868,7 +5009,7 @@
                 <w:sz w:val="20"/>
                 <w:szCs w:val="20"/>
               </w:rPr>
-              <w:t xml:space="preserve">17 (Yes/No)</w:t>
+              <w:t xml:space="preserve">13</w:t>
             </w:r>
           </w:p>
         </w:tc>
@@ -3896,7 +5037,7 @@
                 <w:sz w:val="20"/>
                 <w:szCs w:val="20"/>
               </w:rPr>
-              <w:t xml:space="preserve">17 (0/1)</w:t>
+              <w:t xml:space="preserve">16 (normalisées)</w:t>
             </w:r>
           </w:p>
         </w:tc>
@@ -3926,7 +5067,7 @@
                 <w:sz w:val="20"/>
                 <w:szCs w:val="20"/>
               </w:rPr>
-              <w:t xml:space="preserve">Variables one-hot</w:t>
+              <w:t xml:space="preserve">Variables binaires</w:t>
             </w:r>
           </w:p>
         </w:tc>
@@ -3954,7 +5095,7 @@
                 <w:sz w:val="20"/>
                 <w:szCs w:val="20"/>
               </w:rPr>
-              <w:t xml:space="preserve">8 catégorielles</w:t>
+              <w:t xml:space="preserve">17 (Yes/No)</w:t>
             </w:r>
           </w:p>
         </w:tc>
@@ -3982,7 +5123,7 @@
                 <w:sz w:val="20"/>
                 <w:szCs w:val="20"/>
               </w:rPr>
-              <w:t xml:space="preserve">~61 colonnes binaires</w:t>
+              <w:t xml:space="preserve">17 (0/1)</w:t>
             </w:r>
           </w:p>
         </w:tc>
@@ -4012,6 +5153,178 @@
                 <w:sz w:val="20"/>
                 <w:szCs w:val="20"/>
               </w:rPr>
+              <w:t xml:space="preserve">Variables one-hot</w:t>
+            </w:r>
+          </w:p>
+        </w:tc>
+        <w:tc>
+          <w:tcPr>
+            <w:tcW w:type="dxa" w:w="2500"/>
+            <w:tcBorders>
+              <w:top w:val="single" w:color="CCCCCC" w:sz="1"/>
+              <w:left w:val="single" w:color="CCCCCC" w:sz="1"/>
+              <w:bottom w:val="single" w:color="CCCCCC" w:sz="1"/>
+              <w:right w:val="single" w:color="CCCCCC" w:sz="1"/>
+            </w:tcBorders>
+            <w:shd w:fill="F5F8FC" w:val="clear"/>
+            <w:tcMar>
+              <w:top w:type="dxa" w:w="60"/>
+              <w:left w:type="dxa" w:w="120"/>
+              <w:bottom w:type="dxa" w:w="60"/>
+              <w:right w:type="dxa" w:w="120"/>
+            </w:tcMar>
+          </w:tcPr>
+          <w:p>
+            <w:r>
+              <w:rPr>
+                <w:rFonts w:ascii="Arial" w:cs="Arial" w:eastAsia="Arial" w:hAnsi="Arial"/>
+                <w:sz w:val="20"/>
+                <w:szCs w:val="20"/>
+              </w:rPr>
+              <w:t xml:space="preserve">8 catégorielles</w:t>
+            </w:r>
+          </w:p>
+        </w:tc>
+        <w:tc>
+          <w:tcPr>
+            <w:tcW w:type="dxa" w:w="3026"/>
+            <w:tcBorders>
+              <w:top w:val="single" w:color="CCCCCC" w:sz="1"/>
+              <w:left w:val="single" w:color="CCCCCC" w:sz="1"/>
+              <w:bottom w:val="single" w:color="CCCCCC" w:sz="1"/>
+              <w:right w:val="single" w:color="CCCCCC" w:sz="1"/>
+            </w:tcBorders>
+            <w:shd w:fill="F5F8FC" w:val="clear"/>
+            <w:tcMar>
+              <w:top w:type="dxa" w:w="60"/>
+              <w:left w:type="dxa" w:w="120"/>
+              <w:bottom w:type="dxa" w:w="60"/>
+              <w:right w:type="dxa" w:w="120"/>
+            </w:tcMar>
+          </w:tcPr>
+          <w:p>
+            <w:r>
+              <w:rPr>
+                <w:rFonts w:ascii="Arial" w:cs="Arial" w:eastAsia="Arial" w:hAnsi="Arial"/>
+                <w:sz w:val="20"/>
+                <w:szCs w:val="20"/>
+              </w:rPr>
+              <w:t xml:space="preserve">~61 colonnes binaires</w:t>
+            </w:r>
+          </w:p>
+        </w:tc>
+      </w:tr>
+      <w:tr>
+        <w:tc>
+          <w:tcPr>
+            <w:tcW w:type="dxa" w:w="3500"/>
+            <w:tcBorders>
+              <w:top w:val="single" w:color="CCCCCC" w:sz="1"/>
+              <w:left w:val="single" w:color="CCCCCC" w:sz="1"/>
+              <w:bottom w:val="single" w:color="CCCCCC" w:sz="1"/>
+              <w:right w:val="single" w:color="CCCCCC" w:sz="1"/>
+            </w:tcBorders>
+            <w:shd w:fill="FFFFFF" w:val="clear"/>
+            <w:tcMar>
+              <w:top w:type="dxa" w:w="60"/>
+              <w:left w:type="dxa" w:w="120"/>
+              <w:bottom w:type="dxa" w:w="60"/>
+              <w:right w:type="dxa" w:w="120"/>
+            </w:tcMar>
+          </w:tcPr>
+          <w:p>
+            <w:r>
+              <w:rPr>
+                <w:rFonts w:ascii="Arial" w:cs="Arial" w:eastAsia="Arial" w:hAnsi="Arial"/>
+                <w:sz w:val="20"/>
+                <w:szCs w:val="20"/>
+              </w:rPr>
+              <w:t xml:space="preserve">Outliers</w:t>
+            </w:r>
+          </w:p>
+        </w:tc>
+        <w:tc>
+          <w:tcPr>
+            <w:tcW w:type="dxa" w:w="2500"/>
+            <w:tcBorders>
+              <w:top w:val="single" w:color="CCCCCC" w:sz="1"/>
+              <w:left w:val="single" w:color="CCCCCC" w:sz="1"/>
+              <w:bottom w:val="single" w:color="CCCCCC" w:sz="1"/>
+              <w:right w:val="single" w:color="CCCCCC" w:sz="1"/>
+            </w:tcBorders>
+            <w:shd w:fill="FFFFFF" w:val="clear"/>
+            <w:tcMar>
+              <w:top w:type="dxa" w:w="60"/>
+              <w:left w:type="dxa" w:w="120"/>
+              <w:bottom w:type="dxa" w:w="60"/>
+              <w:right w:type="dxa" w:w="120"/>
+            </w:tcMar>
+          </w:tcPr>
+          <w:p>
+            <w:r>
+              <w:rPr>
+                <w:rFonts w:ascii="Arial" w:cs="Arial" w:eastAsia="Arial" w:hAnsi="Arial"/>
+                <w:sz w:val="20"/>
+                <w:szCs w:val="20"/>
+              </w:rPr>
+              <w:t xml:space="preserve">3 998 identifiés</w:t>
+            </w:r>
+          </w:p>
+        </w:tc>
+        <w:tc>
+          <w:tcPr>
+            <w:tcW w:type="dxa" w:w="3026"/>
+            <w:tcBorders>
+              <w:top w:val="single" w:color="CCCCCC" w:sz="1"/>
+              <w:left w:val="single" w:color="CCCCCC" w:sz="1"/>
+              <w:bottom w:val="single" w:color="CCCCCC" w:sz="1"/>
+              <w:right w:val="single" w:color="CCCCCC" w:sz="1"/>
+            </w:tcBorders>
+            <w:shd w:fill="FFFFFF" w:val="clear"/>
+            <w:tcMar>
+              <w:top w:type="dxa" w:w="60"/>
+              <w:left w:type="dxa" w:w="120"/>
+              <w:bottom w:type="dxa" w:w="60"/>
+              <w:right w:type="dxa" w:w="120"/>
+            </w:tcMar>
+          </w:tcPr>
+          <w:p>
+            <w:r>
+              <w:rPr>
+                <w:rFonts w:ascii="Arial" w:cs="Arial" w:eastAsia="Arial" w:hAnsi="Arial"/>
+                <w:sz w:val="20"/>
+                <w:szCs w:val="20"/>
+              </w:rPr>
+              <w:t xml:space="preserve">Conservés (justification actuarielle)</w:t>
+            </w:r>
+          </w:p>
+        </w:tc>
+      </w:tr>
+      <w:tr>
+        <w:tc>
+          <w:tcPr>
+            <w:tcW w:type="dxa" w:w="3500"/>
+            <w:tcBorders>
+              <w:top w:val="single" w:color="CCCCCC" w:sz="1"/>
+              <w:left w:val="single" w:color="CCCCCC" w:sz="1"/>
+              <w:bottom w:val="single" w:color="CCCCCC" w:sz="1"/>
+              <w:right w:val="single" w:color="CCCCCC" w:sz="1"/>
+            </w:tcBorders>
+            <w:shd w:fill="F5F8FC" w:val="clear"/>
+            <w:tcMar>
+              <w:top w:type="dxa" w:w="60"/>
+              <w:left w:type="dxa" w:w="120"/>
+              <w:bottom w:type="dxa" w:w="60"/>
+              <w:right w:type="dxa" w:w="120"/>
+            </w:tcMar>
+          </w:tcPr>
+          <w:p>
+            <w:r>
+              <w:rPr>
+                <w:rFonts w:ascii="Arial" w:cs="Arial" w:eastAsia="Arial" w:hAnsi="Arial"/>
+                <w:sz w:val="20"/>
+                <w:szCs w:val="20"/>
+              </w:rPr>
               <w:t xml:space="preserve">Sinistres (classe 1)</w:t>
             </w:r>
           </w:p>
@@ -4076,7 +5389,7 @@
     </w:tbl>
     <w:p>
       <w:pPr>
-        <w:spacing w:after="80" w:before="160"/>
+        <w:spacing w:after="80" w:before="80"/>
       </w:pPr>
     </w:p>
     <w:p>
@@ -4133,8 +5446,6 @@
       <w:r>
         <w:rPr>
           <w:rFonts w:ascii="Arial" w:cs="Arial" w:eastAsia="Arial" w:hAnsi="Arial"/>
-          <w:b w:val="false"/>
-          <w:bCs w:val="false"/>
           <w:sz w:val="22"/>
           <w:szCs w:val="22"/>
         </w:rPr>
@@ -4153,8 +5464,6 @@
       <w:r>
         <w:rPr>
           <w:rFonts w:ascii="Arial" w:cs="Arial" w:eastAsia="Arial" w:hAnsi="Arial"/>
-          <w:b w:val="false"/>
-          <w:bCs w:val="false"/>
           <w:sz w:val="22"/>
           <w:szCs w:val="22"/>
         </w:rPr>
@@ -4173,8 +5482,6 @@
       <w:r>
         <w:rPr>
           <w:rFonts w:ascii="Arial" w:cs="Arial" w:eastAsia="Arial" w:hAnsi="Arial"/>
-          <w:b w:val="false"/>
-          <w:bCs w:val="false"/>
           <w:sz w:val="22"/>
           <w:szCs w:val="22"/>
         </w:rPr>
@@ -4193,8 +5500,6 @@
       <w:r>
         <w:rPr>
           <w:rFonts w:ascii="Arial" w:cs="Arial" w:eastAsia="Arial" w:hAnsi="Arial"/>
-          <w:b w:val="false"/>
-          <w:bCs w:val="false"/>
           <w:sz w:val="22"/>
           <w:szCs w:val="22"/>
         </w:rPr>
@@ -4213,8 +5518,6 @@
       <w:r>
         <w:rPr>
           <w:rFonts w:ascii="Arial" w:cs="Arial" w:eastAsia="Arial" w:hAnsi="Arial"/>
-          <w:b w:val="false"/>
-          <w:bCs w:val="false"/>
           <w:sz w:val="22"/>
           <w:szCs w:val="22"/>
         </w:rPr>
@@ -4318,12 +5621,10 @@
       <w:r>
         <w:rPr>
           <w:rFonts w:ascii="Arial" w:cs="Arial" w:eastAsia="Arial" w:hAnsi="Arial"/>
-          <w:b w:val="false"/>
-          <w:bCs w:val="false"/>
           <w:sz w:val="22"/>
           <w:szCs w:val="22"/>
         </w:rPr>
-        <w:t xml:space="preserve">../outputs/data_encoded.csv</w:t>
+        <w:t xml:space="preserve">../outputs/data_encoded.csv — (58 592 × 94)</w:t>
       </w:r>
     </w:p>
     <w:p>
@@ -4338,18 +5639,11 @@
       <w:r>
         <w:rPr>
           <w:rFonts w:ascii="Arial" w:cs="Arial" w:eastAsia="Arial" w:hAnsi="Arial"/>
-          <w:b w:val="false"/>
-          <w:bCs w:val="false"/>
           <w:sz w:val="22"/>
           <w:szCs w:val="22"/>
         </w:rPr>
-        <w:t xml:space="preserve">../outputs/data_preprocessed.csv</w:t>
-      </w:r>
-    </w:p>
-    <w:p>
-      <w:pPr>
-        <w:spacing w:after="80" w:before="160"/>
-      </w:pPr>
+        <w:t xml:space="preserve">../outputs/data_preprocessed.csv — (58 592 × 94)</w:t>
+      </w:r>
     </w:p>
     <w:sectPr>
       <w:footerReference w:type="default" r:id="rId7"/>

</xml_diff>